<commit_message>
feat: enhance Solicitud de Desembolso with NIT placeholder and checkbox population
Enhancements:
- Add [NIT] placeholder support to document generation
- Auto-populate Gastos Nacionales checkboxes based on Anexo items
- Fix cotizacion parser to handle Colombian COP amount format
- Fix frontend snake_case/camelCase field mapping
- Fix monto_total string concatenation issue

Backend changes:
- document_service.py: Add GASTOS_CATEGORY_KEYWORDS and checkbox population
- cotizacion_parser_service.py: Fix COP amount parsing (periods as thousands)
- operations_routes.py: Fix data snapshot field names

Frontend changes:
- FKSolicitudDesembolsoRequest.tsx: Fix field name mapping
- legal.ts: Align types with backend snake_case fields

Tests:
- Add 36 unit tests for document service and cotizacion parser
- Add E2E test commands for Solicitud de Desembolso workflow

🤖 Generated with [Claude Code](https://claude.com/claude-code)

Co-Authored-By: Claude <noreply@anthropic.com>
</commit_message>
<xml_diff>
--- a/backend/templates/FK COL - Fin. COP - Solicitud de Desembolso.docx
+++ b/backend/templates/FK COL - Fin. COP - Solicitud de Desembolso.docx
@@ -1,6 +1,6 @@
 
 <file path=word/document.xml><?xml version="1.0" encoding="utf-8"?>
-<w:document xmlns:wpc="http://schemas.microsoft.com/office/word/2010/wordprocessingCanvas" xmlns:cx="http://schemas.microsoft.com/office/drawing/2014/chartex" xmlns:cx1="http://schemas.microsoft.com/office/drawing/2015/9/8/chartex" xmlns:cx2="http://schemas.microsoft.com/office/drawing/2015/10/21/chartex" xmlns:cx3="http://schemas.microsoft.com/office/drawing/2016/5/9/chartex" xmlns:cx4="http://schemas.microsoft.com/office/drawing/2016/5/10/chartex" xmlns:cx5="http://schemas.microsoft.com/office/drawing/2016/5/11/chartex" xmlns:cx6="http://schemas.microsoft.com/office/drawing/2016/5/12/chartex" xmlns:cx7="http://schemas.microsoft.com/office/drawing/2016/5/13/chartex" xmlns:cx8="http://schemas.microsoft.com/office/drawing/2016/5/14/chartex" xmlns:mc="http://schemas.openxmlformats.org/markup-compatibility/2006" xmlns:aink="http://schemas.microsoft.com/office/drawing/2016/ink" xmlns:am3d="http://schemas.microsoft.com/office/drawing/2017/model3d" xmlns:o="urn:schemas-microsoft-com:office:office" xmlns:oel="http://schemas.microsoft.com/office/2019/extlst" xmlns:r="http://schemas.openxmlformats.org/officeDocument/2006/relationships" xmlns:m="http://schemas.openxmlformats.org/officeDocument/2006/math" xmlns:v="urn:schemas-microsoft-com:vml" xmlns:wp14="http://schemas.microsoft.com/office/word/2010/wordprocessingDrawing" xmlns:wp="http://schemas.openxmlformats.org/drawingml/2006/wordprocessingDrawing" xmlns:w10="urn:schemas-microsoft-com:office:word" xmlns:w="http://schemas.openxmlformats.org/wordprocessingml/2006/main" xmlns:w14="http://schemas.microsoft.com/office/word/2010/wordml" xmlns:w15="http://schemas.microsoft.com/office/word/2012/wordml" xmlns:w16cex="http://schemas.microsoft.com/office/word/2018/wordml/cex" xmlns:w16cid="http://schemas.microsoft.com/office/word/2016/wordml/cid" xmlns:w16="http://schemas.microsoft.com/office/word/2018/wordml" xmlns:w16du="http://schemas.microsoft.com/office/word/2023/wordml/word16du" xmlns:w16sdtdh="http://schemas.microsoft.com/office/word/2020/wordml/sdtdatahash" xmlns:w16sdtfl="http://schemas.microsoft.com/office/word/2024/wordml/sdtformatlock" xmlns:w16se="http://schemas.microsoft.com/office/word/2015/wordml/symex" xmlns:wpg="http://schemas.microsoft.com/office/word/2010/wordprocessingGroup" xmlns:wpi="http://schemas.microsoft.com/office/word/2010/wordprocessingInk" xmlns:wne="http://schemas.microsoft.com/office/word/2006/wordml" xmlns:wps="http://schemas.microsoft.com/office/word/2010/wordprocessingShape" mc:Ignorable="w14 w15 w16se w16cid w16 w16cex w16sdtdh w16sdtfl w16du wp14">
+<w:document xmlns:wpc="http://schemas.microsoft.com/office/word/2010/wordprocessingCanvas" xmlns:cx="http://schemas.microsoft.com/office/drawing/2014/chartex" xmlns:cx1="http://schemas.microsoft.com/office/drawing/2015/9/8/chartex" xmlns:cx2="http://schemas.microsoft.com/office/drawing/2015/10/21/chartex" xmlns:cx3="http://schemas.microsoft.com/office/drawing/2016/5/9/chartex" xmlns:cx4="http://schemas.microsoft.com/office/drawing/2016/5/10/chartex" xmlns:cx5="http://schemas.microsoft.com/office/drawing/2016/5/11/chartex" xmlns:cx6="http://schemas.microsoft.com/office/drawing/2016/5/12/chartex" xmlns:cx7="http://schemas.microsoft.com/office/drawing/2016/5/13/chartex" xmlns:cx8="http://schemas.microsoft.com/office/drawing/2016/5/14/chartex" xmlns:mc="http://schemas.openxmlformats.org/markup-compatibility/2006" xmlns:aink="http://schemas.microsoft.com/office/drawing/2016/ink" xmlns:am3d="http://schemas.microsoft.com/office/drawing/2017/model3d" xmlns:o="urn:schemas-microsoft-com:office:office" xmlns:oel="http://schemas.microsoft.com/office/2019/extlst" xmlns:r="http://schemas.openxmlformats.org/officeDocument/2006/relationships" xmlns:m="http://schemas.openxmlformats.org/officeDocument/2006/math" xmlns:v="urn:schemas-microsoft-com:vml" xmlns:wp14="http://schemas.microsoft.com/office/word/2010/wordprocessingDrawing" xmlns:wp="http://schemas.openxmlformats.org/drawingml/2006/wordprocessingDrawing" xmlns:w10="urn:schemas-microsoft-com:office:word" xmlns:w="http://schemas.openxmlformats.org/wordprocessingml/2006/main" xmlns:w14="http://schemas.microsoft.com/office/word/2010/wordml" xmlns:w15="http://schemas.microsoft.com/office/word/2012/wordml" xmlns:w16cex="http://schemas.microsoft.com/office/word/2018/wordml/cex" xmlns:w16cid="http://schemas.microsoft.com/office/word/2016/wordml/cid" xmlns:w16="http://schemas.microsoft.com/office/word/2018/wordml" xmlns:w16sdtdh="http://schemas.microsoft.com/office/word/2020/wordml/sdtdatahash" xmlns:w16se="http://schemas.microsoft.com/office/word/2015/wordml/symex" xmlns:wpg="http://schemas.microsoft.com/office/word/2010/wordprocessingGroup" xmlns:wpi="http://schemas.microsoft.com/office/word/2010/wordprocessingInk" xmlns:wne="http://schemas.microsoft.com/office/word/2006/wordml" xmlns:wps="http://schemas.microsoft.com/office/word/2010/wordprocessingShape" mc:Ignorable="w14 w15 w16se w16cid w16 w16cex w16sdtdh wp14">
   <w:body>
     <w:p>
       <w:pPr>
@@ -105,26 +105,7 @@
                 <w:szCs w:val="18"/>
                 <w:highlight w:val="yellow"/>
               </w:rPr>
-              <w:t>Número de cotización de d</w:t>
-            </w:r>
-            <w:commentRangeStart w:id="5"/>
-            <w:r>
-              <w:rPr>
-                <w:rFonts w:cs="Open Sans"/>
-                <w:bCs/>
-                <w:sz w:val="18"/>
-                <w:szCs w:val="18"/>
-                <w:highlight w:val="yellow"/>
-              </w:rPr>
-              <w:t>esembolso</w:t>
-            </w:r>
-            <w:commentRangeEnd w:id="5"/>
-            <w:r>
-              <w:rPr>
-                <w:rStyle w:val="CommentReference"/>
-                <w:rFonts w:eastAsiaTheme="majorEastAsia"/>
-              </w:rPr>
-              <w:commentReference w:id="5"/>
+              <w:t>Número de cotización de desembolso</w:t>
             </w:r>
             <w:r>
               <w:rPr>
@@ -291,7 +272,6 @@
               </w:rPr>
               <w:t xml:space="preserve">Contrato de Crédito en Pesos No. </w:t>
             </w:r>
-            <w:proofErr w:type="gramStart"/>
             <w:r>
               <w:rPr>
                 <w:rFonts w:cs="Open Sans"/>
@@ -300,37 +280,85 @@
                 <w:szCs w:val="18"/>
                 <w:lang w:val="es-CO"/>
               </w:rPr>
-              <w:t>CO:NIT</w:t>
-            </w:r>
-            <w:proofErr w:type="gramEnd"/>
+              <w:t>CO:</w:t>
+            </w:r>
             <w:r>
               <w:rPr>
                 <w:rFonts w:cs="Open Sans"/>
                 <w:spacing w:val="1"/>
                 <w:sz w:val="18"/>
                 <w:szCs w:val="18"/>
-                <w:lang w:val="es-CO"/>
-              </w:rPr>
-              <w:t>:1:D:</w:t>
-            </w:r>
-            <w:proofErr w:type="gramStart"/>
+                <w:highlight w:val="yellow"/>
+                <w:lang w:val="es-CO"/>
+              </w:rPr>
+              <w:t>[</w:t>
+            </w:r>
             <w:r>
               <w:rPr>
                 <w:rFonts w:cs="Open Sans"/>
                 <w:spacing w:val="1"/>
                 <w:sz w:val="18"/>
                 <w:szCs w:val="18"/>
-                <w:lang w:val="es-CO"/>
-              </w:rPr>
-              <w:t>M:DOM</w:t>
-            </w:r>
-            <w:proofErr w:type="gramEnd"/>
+                <w:highlight w:val="yellow"/>
+                <w:lang w:val="es-CO"/>
+              </w:rPr>
+              <w:t>NIT</w:t>
+            </w:r>
             <w:r>
               <w:rPr>
                 <w:rFonts w:cs="Open Sans"/>
                 <w:spacing w:val="1"/>
                 <w:sz w:val="18"/>
                 <w:szCs w:val="18"/>
+                <w:highlight w:val="yellow"/>
+                <w:lang w:val="es-CO"/>
+              </w:rPr>
+              <w:t>]</w:t>
+            </w:r>
+            <w:r>
+              <w:rPr>
+                <w:rFonts w:cs="Open Sans"/>
+                <w:spacing w:val="1"/>
+                <w:sz w:val="18"/>
+                <w:szCs w:val="18"/>
+                <w:lang w:val="es-CO"/>
+              </w:rPr>
+              <w:t xml:space="preserve">:1:D:M:DOM </w:t>
+            </w:r>
+            <w:r>
+              <w:rPr>
+                <w:rFonts w:cs="Open Sans"/>
+                <w:spacing w:val="1"/>
+                <w:sz w:val="18"/>
+                <w:szCs w:val="18"/>
+                <w:lang w:val="es-CO"/>
+              </w:rPr>
+              <w:t xml:space="preserve">de fecha </w:t>
+            </w:r>
+            <w:r>
+              <w:rPr>
+                <w:rFonts w:cs="Open Sans"/>
+                <w:sz w:val="18"/>
+                <w:szCs w:val="18"/>
+                <w:lang w:val="es-CO"/>
+              </w:rPr>
+              <w:t>[</w:t>
+            </w:r>
+            <w:r>
+              <w:rPr>
+                <w:rFonts w:cs="Open Sans"/>
+                <w:sz w:val="18"/>
+                <w:szCs w:val="18"/>
+                <w:highlight w:val="yellow"/>
+                <w:lang w:val="es-CO"/>
+              </w:rPr>
+              <w:t>día</w:t>
+            </w:r>
+            <w:r>
+              <w:rPr>
+                <w:rFonts w:cs="Open Sans"/>
+                <w:sz w:val="18"/>
+                <w:szCs w:val="18"/>
                 <w:lang w:val="es-CO"/>
               </w:rPr>
               <w:t xml:space="preserve"> </w:t>
@@ -338,40 +366,21 @@
             <w:r>
               <w:rPr>
                 <w:rFonts w:cs="Open Sans"/>
-                <w:spacing w:val="1"/>
-                <w:sz w:val="18"/>
-                <w:szCs w:val="18"/>
-                <w:lang w:val="es-CO"/>
-              </w:rPr>
-              <w:t xml:space="preserve">de fecha </w:t>
-            </w:r>
-            <w:r>
-              <w:rPr>
-                <w:rFonts w:cs="Open Sans"/>
-                <w:sz w:val="18"/>
-                <w:szCs w:val="18"/>
-                <w:lang w:val="es-CO"/>
-              </w:rPr>
-              <w:t>[</w:t>
-            </w:r>
-            <w:r>
-              <w:rPr>
-                <w:rFonts w:cs="Open Sans"/>
                 <w:sz w:val="18"/>
                 <w:szCs w:val="18"/>
                 <w:highlight w:val="yellow"/>
                 <w:lang w:val="es-CO"/>
               </w:rPr>
-              <w:t>día</w:t>
-            </w:r>
-            <w:r>
-              <w:rPr>
-                <w:rFonts w:cs="Open Sans"/>
-                <w:sz w:val="18"/>
-                <w:szCs w:val="18"/>
-                <w:lang w:val="es-CO"/>
-              </w:rPr>
-              <w:t xml:space="preserve"> </w:t>
+              <w:t>de firma del contrato de crédito</w:t>
+            </w:r>
+            <w:r>
+              <w:rPr>
+                <w:rFonts w:cs="Open Sans"/>
+                <w:sz w:val="18"/>
+                <w:szCs w:val="18"/>
+                <w:lang w:val="es-CO"/>
+              </w:rPr>
+              <w:t>] de [</w:t>
             </w:r>
             <w:r>
               <w:rPr>
@@ -381,16 +390,7 @@
                 <w:highlight w:val="yellow"/>
                 <w:lang w:val="es-CO"/>
               </w:rPr>
-              <w:t>de firma del contrato de crédito</w:t>
-            </w:r>
-            <w:r>
-              <w:rPr>
-                <w:rFonts w:cs="Open Sans"/>
-                <w:sz w:val="18"/>
-                <w:szCs w:val="18"/>
-                <w:lang w:val="es-CO"/>
-              </w:rPr>
-              <w:t>] de [</w:t>
+              <w:t>mes</w:t>
             </w:r>
             <w:r>
               <w:rPr>
@@ -400,27 +400,7 @@
                 <w:highlight w:val="yellow"/>
                 <w:lang w:val="es-CO"/>
               </w:rPr>
-              <w:t>mes</w:t>
-            </w:r>
-            <w:r>
-              <w:rPr>
-                <w:rFonts w:cs="Open Sans"/>
-                <w:sz w:val="18"/>
-                <w:szCs w:val="18"/>
-                <w:highlight w:val="yellow"/>
-                <w:lang w:val="es-CO"/>
-              </w:rPr>
-              <w:t xml:space="preserve"> </w:t>
-            </w:r>
-            <w:r>
-              <w:rPr>
-                <w:rFonts w:cs="Open Sans"/>
-                <w:sz w:val="18"/>
-                <w:szCs w:val="18"/>
-                <w:highlight w:val="yellow"/>
-                <w:lang w:val="es-CO"/>
-              </w:rPr>
-              <w:t>de firma del contrato de crédito</w:t>
+              <w:t xml:space="preserve"> de firma del contrato de crédito</w:t>
             </w:r>
             <w:r>
               <w:rPr>
@@ -745,8 +725,9 @@
           </w:p>
           <w:tbl>
             <w:tblPr>
-              <w:tblStyle w:val="TableGrid"/>
+              <w:tblStyle w:val="Tablaconcuadrcula"/>
               <w:tblW w:w="19702" w:type="dxa"/>
+              <w:tblLayout w:type="fixed"/>
               <w:tblCellMar>
                 <w:top w:w="28" w:type="dxa"/>
                 <w:left w:w="28" w:type="dxa"/>
@@ -1200,18 +1181,7 @@
                 <w:u w:val="single"/>
                 <w:lang w:val="es-CO"/>
               </w:rPr>
-              <w:t xml:space="preserve"> de </w:t>
-            </w:r>
-            <w:proofErr w:type="gramStart"/>
-            <w:r>
-              <w:rPr>
-                <w:rFonts w:cs="Open Sans"/>
-                <w:sz w:val="18"/>
-                <w:szCs w:val="18"/>
-                <w:u w:val="single"/>
-                <w:lang w:val="es-CO"/>
-              </w:rPr>
-              <w:t>Pago</w:t>
+              <w:t xml:space="preserve"> de Pago</w:t>
             </w:r>
             <w:r>
               <w:rPr>
@@ -1222,7 +1192,6 @@
               </w:rPr>
               <w:t>.*</w:t>
             </w:r>
-            <w:proofErr w:type="gramEnd"/>
           </w:p>
           <w:p>
             <w:pPr>
@@ -1319,26 +1288,7 @@
                 <w:szCs w:val="18"/>
                 <w:highlight w:val="yellow"/>
               </w:rPr>
-              <w:t>Número de cotización de d</w:t>
-            </w:r>
-            <w:commentRangeStart w:id="6"/>
-            <w:r>
-              <w:rPr>
-                <w:rFonts w:cs="Open Sans"/>
-                <w:bCs/>
-                <w:sz w:val="18"/>
-                <w:szCs w:val="18"/>
-                <w:highlight w:val="yellow"/>
-              </w:rPr>
-              <w:t>esembolso</w:t>
-            </w:r>
-            <w:commentRangeEnd w:id="6"/>
-            <w:r>
-              <w:rPr>
-                <w:rStyle w:val="CommentReference"/>
-                <w:rFonts w:eastAsiaTheme="majorEastAsia"/>
-              </w:rPr>
-              <w:commentReference w:id="6"/>
+              <w:t>Número de cotización de desembolso</w:t>
             </w:r>
             <w:r>
               <w:rPr>
@@ -1562,7 +1512,6 @@
               </w:rPr>
               <w:t>[</w:t>
             </w:r>
-            <w:commentRangeStart w:id="7"/>
             <w:r>
               <w:rPr>
                 <w:rFonts w:cs="Open Sans"/>
@@ -1572,14 +1521,6 @@
                 <w:lang w:val="pt-PT"/>
               </w:rPr>
               <w:t>monto</w:t>
-            </w:r>
-            <w:commentRangeEnd w:id="7"/>
-            <w:r>
-              <w:rPr>
-                <w:rStyle w:val="CommentReference"/>
-                <w:lang w:val="es-CO" w:eastAsia="es-ES"/>
-              </w:rPr>
-              <w:commentReference w:id="7"/>
             </w:r>
             <w:r>
               <w:rPr>
@@ -1652,27 +1593,7 @@
                 <w:szCs w:val="18"/>
                 <w:lang w:val="es-CO"/>
               </w:rPr>
-              <w:t xml:space="preserve">los intereses que se generen con ocasión </w:t>
-            </w:r>
-            <w:proofErr w:type="gramStart"/>
-            <w:r>
-              <w:rPr>
-                <w:rFonts w:cs="Open Sans"/>
-                <w:sz w:val="18"/>
-                <w:szCs w:val="18"/>
-                <w:lang w:val="es-CO"/>
-              </w:rPr>
-              <w:t>del mismo</w:t>
-            </w:r>
-            <w:proofErr w:type="gramEnd"/>
-            <w:r>
-              <w:rPr>
-                <w:rFonts w:cs="Open Sans"/>
-                <w:sz w:val="18"/>
-                <w:szCs w:val="18"/>
-                <w:lang w:val="es-CO"/>
-              </w:rPr>
-              <w:t xml:space="preserve"> </w:t>
+              <w:t xml:space="preserve">los intereses que se generen con ocasión del mismo </w:t>
             </w:r>
             <w:r>
               <w:rPr>
@@ -1733,7 +1654,6 @@
               </w:rPr>
               <w:t>[</w:t>
             </w:r>
-            <w:commentRangeStart w:id="8"/>
             <w:r>
               <w:rPr>
                 <w:rFonts w:cs="Open Sans"/>
@@ -1753,14 +1673,6 @@
                 <w:lang w:val="es-CO"/>
               </w:rPr>
               <w:t>]</w:t>
-            </w:r>
-            <w:commentRangeEnd w:id="8"/>
-            <w:r>
-              <w:rPr>
-                <w:rStyle w:val="CommentReference"/>
-                <w:lang w:val="es-CO" w:eastAsia="es-ES"/>
-              </w:rPr>
-              <w:commentReference w:id="8"/>
             </w:r>
             <w:r>
               <w:rPr>
@@ -1920,7 +1832,7 @@
           </w:tcPr>
           <w:p>
             <w:pPr>
-              <w:pStyle w:val="ListParagraph"/>
+              <w:pStyle w:val="Prrafodelista"/>
               <w:numPr>
                 <w:ilvl w:val="0"/>
                 <w:numId w:val="54"/>
@@ -2112,7 +2024,7 @@
           </w:p>
           <w:p>
             <w:pPr>
-              <w:pStyle w:val="ListParagraph"/>
+              <w:pStyle w:val="Prrafodelista"/>
               <w:numPr>
                 <w:ilvl w:val="0"/>
                 <w:numId w:val="54"/>
@@ -2177,7 +2089,7 @@
           </w:p>
           <w:p>
             <w:pPr>
-              <w:pStyle w:val="ListParagraph"/>
+              <w:pStyle w:val="Prrafodelista"/>
               <w:numPr>
                 <w:ilvl w:val="0"/>
                 <w:numId w:val="54"/>
@@ -2236,7 +2148,6 @@
               <w:t xml:space="preserve"> Autorizado del Cliente a través de la Plataforma mediante “</w:t>
             </w:r>
             <w:proofErr w:type="spellStart"/>
-            <w:proofErr w:type="gramStart"/>
             <w:r>
               <w:rPr>
                 <w:rFonts w:cs="Open Sans"/>
@@ -2248,7 +2159,6 @@
               <w:t>click</w:t>
             </w:r>
             <w:proofErr w:type="spellEnd"/>
-            <w:proofErr w:type="gramEnd"/>
             <w:r>
               <w:rPr>
                 <w:rFonts w:cs="Open Sans"/>
@@ -2353,21 +2263,12 @@
               </w:rPr>
               <w:br/>
             </w:r>
-            <w:commentRangeStart w:id="9"/>
             <w:r>
               <w:rPr>
                 <w:u w:val="single"/>
                 <w:lang w:val="pt-PT"/>
               </w:rPr>
               <w:t>LISTADO DE INSTRUMENTOS DE PAGO</w:t>
-            </w:r>
-            <w:commentRangeEnd w:id="9"/>
-            <w:r>
-              <w:rPr>
-                <w:rStyle w:val="CommentReference"/>
-                <w:lang w:eastAsia="es-ES"/>
-              </w:rPr>
-              <w:commentReference w:id="9"/>
             </w:r>
           </w:p>
         </w:tc>
@@ -3875,12 +3776,12 @@
       </w:pPr>
     </w:p>
     <w:sectPr>
-      <w:headerReference w:type="even" r:id="rId12"/>
-      <w:headerReference w:type="default" r:id="rId13"/>
-      <w:footerReference w:type="even" r:id="rId14"/>
-      <w:footerReference w:type="default" r:id="rId15"/>
-      <w:headerReference w:type="first" r:id="rId16"/>
-      <w:footerReference w:type="first" r:id="rId17"/>
+      <w:headerReference w:type="even" r:id="rId8"/>
+      <w:headerReference w:type="default" r:id="rId9"/>
+      <w:footerReference w:type="even" r:id="rId10"/>
+      <w:footerReference w:type="default" r:id="rId11"/>
+      <w:headerReference w:type="first" r:id="rId12"/>
+      <w:footerReference w:type="first" r:id="rId13"/>
       <w:pgSz w:w="12240" w:h="15840" w:code="1"/>
       <w:pgMar w:top="1134" w:right="1134" w:bottom="1134" w:left="1134" w:header="709" w:footer="527" w:gutter="0"/>
       <w:pgNumType w:fmt="lowerRoman" w:start="1"/>
@@ -3891,130 +3792,8 @@
 </w:document>
 </file>
 
-<file path=word/comments.xml><?xml version="1.0" encoding="utf-8"?>
-<w:comments xmlns:wpc="http://schemas.microsoft.com/office/word/2010/wordprocessingCanvas" xmlns:cx="http://schemas.microsoft.com/office/drawing/2014/chartex" xmlns:cx1="http://schemas.microsoft.com/office/drawing/2015/9/8/chartex" xmlns:cx2="http://schemas.microsoft.com/office/drawing/2015/10/21/chartex" xmlns:cx3="http://schemas.microsoft.com/office/drawing/2016/5/9/chartex" xmlns:cx4="http://schemas.microsoft.com/office/drawing/2016/5/10/chartex" xmlns:cx5="http://schemas.microsoft.com/office/drawing/2016/5/11/chartex" xmlns:cx6="http://schemas.microsoft.com/office/drawing/2016/5/12/chartex" xmlns:cx7="http://schemas.microsoft.com/office/drawing/2016/5/13/chartex" xmlns:cx8="http://schemas.microsoft.com/office/drawing/2016/5/14/chartex" xmlns:mc="http://schemas.openxmlformats.org/markup-compatibility/2006" xmlns:aink="http://schemas.microsoft.com/office/drawing/2016/ink" xmlns:am3d="http://schemas.microsoft.com/office/drawing/2017/model3d" xmlns:o="urn:schemas-microsoft-com:office:office" xmlns:oel="http://schemas.microsoft.com/office/2019/extlst" xmlns:r="http://schemas.openxmlformats.org/officeDocument/2006/relationships" xmlns:m="http://schemas.openxmlformats.org/officeDocument/2006/math" xmlns:v="urn:schemas-microsoft-com:vml" xmlns:wp14="http://schemas.microsoft.com/office/word/2010/wordprocessingDrawing" xmlns:wp="http://schemas.openxmlformats.org/drawingml/2006/wordprocessingDrawing" xmlns:w10="urn:schemas-microsoft-com:office:word" xmlns:w="http://schemas.openxmlformats.org/wordprocessingml/2006/main" xmlns:w14="http://schemas.microsoft.com/office/word/2010/wordml" xmlns:w15="http://schemas.microsoft.com/office/word/2012/wordml" xmlns:w16cex="http://schemas.microsoft.com/office/word/2018/wordml/cex" xmlns:w16cid="http://schemas.microsoft.com/office/word/2016/wordml/cid" xmlns:w16="http://schemas.microsoft.com/office/word/2018/wordml" xmlns:w16du="http://schemas.microsoft.com/office/word/2023/wordml/word16du" xmlns:w16sdtdh="http://schemas.microsoft.com/office/word/2020/wordml/sdtdatahash" xmlns:w16sdtfl="http://schemas.microsoft.com/office/word/2024/wordml/sdtformatlock" xmlns:w16se="http://schemas.microsoft.com/office/word/2015/wordml/symex" xmlns:wpg="http://schemas.microsoft.com/office/word/2010/wordprocessingGroup" xmlns:wpi="http://schemas.microsoft.com/office/word/2010/wordprocessingInk" xmlns:wne="http://schemas.microsoft.com/office/word/2006/wordml" xmlns:wps="http://schemas.microsoft.com/office/word/2010/wordprocessingShape" mc:Ignorable="w14 w15 w16se w16cid w16 w16cex w16sdtdh w16sdtfl w16du wp14">
-  <w:comment w:id="5" w:author="Sofia Tobon -FK" w:date="2025-12-01T07:54:00Z" w:initials="ST">
-    <w:p>
-      <w:pPr>
-        <w:pStyle w:val="CommentText"/>
-        <w:jc w:val="left"/>
-      </w:pPr>
-      <w:r>
-        <w:rPr>
-          <w:rStyle w:val="CommentReference"/>
-          <w:rFonts w:eastAsiaTheme="majorEastAsia"/>
-        </w:rPr>
-        <w:annotationRef/>
-      </w:r>
-      <w:r>
-        <w:t xml:space="preserve">Este valor está contenido en la cotización de desembolso que prepara directamente el equipo de pricing. </w:t>
-      </w:r>
-    </w:p>
-  </w:comment>
-  <w:comment w:id="6" w:author="Sofia Tobon -FK" w:date="2025-12-01T07:54:00Z" w:initials="ST">
-    <w:p>
-      <w:pPr>
-        <w:pStyle w:val="CommentText"/>
-        <w:jc w:val="left"/>
-      </w:pPr>
-      <w:r>
-        <w:rPr>
-          <w:rStyle w:val="CommentReference"/>
-          <w:rFonts w:eastAsiaTheme="majorEastAsia"/>
-        </w:rPr>
-        <w:annotationRef/>
-      </w:r>
-      <w:r>
-        <w:t xml:space="preserve">Este valor está contenido en la cotización de desembolso que prepara directamente el equipo de pricing. </w:t>
-      </w:r>
-    </w:p>
-  </w:comment>
-  <w:comment w:id="7" w:author="Sofia Tobon -FK" w:date="2025-12-01T08:10:00Z" w:initials="ST">
-    <w:p>
-      <w:pPr>
-        <w:pStyle w:val="CommentText"/>
-        <w:jc w:val="left"/>
-      </w:pPr>
-      <w:r>
-        <w:rPr>
-          <w:rStyle w:val="CommentReference"/>
-        </w:rPr>
-        <w:annotationRef/>
-      </w:r>
-      <w:r>
-        <w:t>Este valor está contenido en la cotización de desembolso que prepara el equipo de Pricing</w:t>
-      </w:r>
-    </w:p>
-  </w:comment>
-  <w:comment w:id="8" w:author="Sofia Tobon -FK" w:date="2025-12-01T08:11:00Z" w:initials="ST">
-    <w:p>
-      <w:pPr>
-        <w:pStyle w:val="CommentText"/>
-        <w:jc w:val="left"/>
-      </w:pPr>
-      <w:r>
-        <w:rPr>
-          <w:rStyle w:val="CommentReference"/>
-        </w:rPr>
-        <w:annotationRef/>
-      </w:r>
-      <w:r>
-        <w:t>Este valor lo da el equipo de Pricing</w:t>
-      </w:r>
-    </w:p>
-  </w:comment>
-  <w:comment w:id="9" w:author="Sofia Tobon -FK" w:date="2025-12-01T08:11:00Z" w:initials="ST">
-    <w:p>
-      <w:pPr>
-        <w:pStyle w:val="CommentText"/>
-        <w:jc w:val="left"/>
-      </w:pPr>
-      <w:r>
-        <w:rPr>
-          <w:rStyle w:val="CommentReference"/>
-        </w:rPr>
-        <w:annotationRef/>
-      </w:r>
-      <w:r>
-        <w:t>Este listado esta contenido en la cotización que nos da el equipo de Pricing como el Anexo I. Entonces la tablita se copy paste de ese documento. Si no se puede automatizar, lo puedo hacer yo manualmente!</w:t>
-      </w:r>
-    </w:p>
-  </w:comment>
-</w:comments>
-</file>
-
-<file path=word/commentsExtended.xml><?xml version="1.0" encoding="utf-8"?>
-<w15:commentsEx xmlns:wpc="http://schemas.microsoft.com/office/word/2010/wordprocessingCanvas" xmlns:cx="http://schemas.microsoft.com/office/drawing/2014/chartex" xmlns:cx1="http://schemas.microsoft.com/office/drawing/2015/9/8/chartex" xmlns:cx2="http://schemas.microsoft.com/office/drawing/2015/10/21/chartex" xmlns:cx3="http://schemas.microsoft.com/office/drawing/2016/5/9/chartex" xmlns:cx4="http://schemas.microsoft.com/office/drawing/2016/5/10/chartex" xmlns:cx5="http://schemas.microsoft.com/office/drawing/2016/5/11/chartex" xmlns:cx6="http://schemas.microsoft.com/office/drawing/2016/5/12/chartex" xmlns:cx7="http://schemas.microsoft.com/office/drawing/2016/5/13/chartex" xmlns:cx8="http://schemas.microsoft.com/office/drawing/2016/5/14/chartex" xmlns:mc="http://schemas.openxmlformats.org/markup-compatibility/2006" xmlns:aink="http://schemas.microsoft.com/office/drawing/2016/ink" xmlns:am3d="http://schemas.microsoft.com/office/drawing/2017/model3d" xmlns:o="urn:schemas-microsoft-com:office:office" xmlns:oel="http://schemas.microsoft.com/office/2019/extlst" xmlns:r="http://schemas.openxmlformats.org/officeDocument/2006/relationships" xmlns:m="http://schemas.openxmlformats.org/officeDocument/2006/math" xmlns:v="urn:schemas-microsoft-com:vml" xmlns:wp14="http://schemas.microsoft.com/office/word/2010/wordprocessingDrawing" xmlns:wp="http://schemas.openxmlformats.org/drawingml/2006/wordprocessingDrawing" xmlns:w10="urn:schemas-microsoft-com:office:word" xmlns:w="http://schemas.openxmlformats.org/wordprocessingml/2006/main" xmlns:w14="http://schemas.microsoft.com/office/word/2010/wordml" xmlns:w15="http://schemas.microsoft.com/office/word/2012/wordml" xmlns:w16cex="http://schemas.microsoft.com/office/word/2018/wordml/cex" xmlns:w16cid="http://schemas.microsoft.com/office/word/2016/wordml/cid" xmlns:w16="http://schemas.microsoft.com/office/word/2018/wordml" xmlns:w16du="http://schemas.microsoft.com/office/word/2023/wordml/word16du" xmlns:w16sdtdh="http://schemas.microsoft.com/office/word/2020/wordml/sdtdatahash" xmlns:w16sdtfl="http://schemas.microsoft.com/office/word/2024/wordml/sdtformatlock" xmlns:w16se="http://schemas.microsoft.com/office/word/2015/wordml/symex" xmlns:wpg="http://schemas.microsoft.com/office/word/2010/wordprocessingGroup" xmlns:wpi="http://schemas.microsoft.com/office/word/2010/wordprocessingInk" xmlns:wne="http://schemas.microsoft.com/office/word/2006/wordml" xmlns:wps="http://schemas.microsoft.com/office/word/2010/wordprocessingShape" mc:Ignorable="w14 w15 w16se w16cid w16 w16cex w16sdtdh w16sdtfl w16du wp14">
-  <w15:commentEx w15:paraId="1992592D" w15:done="0"/>
-  <w15:commentEx w15:paraId="477C2B63" w15:done="0"/>
-  <w15:commentEx w15:paraId="3B53EF7D" w15:done="0"/>
-  <w15:commentEx w15:paraId="495CAA7D" w15:done="0"/>
-  <w15:commentEx w15:paraId="372A78E1" w15:done="0"/>
-</w15:commentsEx>
-</file>
-
-<file path=word/commentsExtensible.xml><?xml version="1.0" encoding="utf-8"?>
-<w16cex:commentsExtensible xmlns:wpc="http://schemas.microsoft.com/office/word/2010/wordprocessingCanvas" xmlns:cx="http://schemas.microsoft.com/office/drawing/2014/chartex" xmlns:cx1="http://schemas.microsoft.com/office/drawing/2015/9/8/chartex" xmlns:cx2="http://schemas.microsoft.com/office/drawing/2015/10/21/chartex" xmlns:cx3="http://schemas.microsoft.com/office/drawing/2016/5/9/chartex" xmlns:cx4="http://schemas.microsoft.com/office/drawing/2016/5/10/chartex" xmlns:cx5="http://schemas.microsoft.com/office/drawing/2016/5/11/chartex" xmlns:cx6="http://schemas.microsoft.com/office/drawing/2016/5/12/chartex" xmlns:cx7="http://schemas.microsoft.com/office/drawing/2016/5/13/chartex" xmlns:cx8="http://schemas.microsoft.com/office/drawing/2016/5/14/chartex" xmlns:cr="http://schemas.microsoft.com/office/comments/2020/reactions" xmlns:mc="http://schemas.openxmlformats.org/markup-compatibility/2006" xmlns:aink="http://schemas.microsoft.com/office/drawing/2016/ink" xmlns:am3d="http://schemas.microsoft.com/office/drawing/2017/model3d" xmlns:o="urn:schemas-microsoft-com:office:office" xmlns:oel="http://schemas.microsoft.com/office/2019/extlst" xmlns:r="http://schemas.openxmlformats.org/officeDocument/2006/relationships" xmlns:m="http://schemas.openxmlformats.org/officeDocument/2006/math" xmlns:v="urn:schemas-microsoft-com:vml" xmlns:wp14="http://schemas.microsoft.com/office/word/2010/wordprocessingDrawing" xmlns:wp="http://schemas.openxmlformats.org/drawingml/2006/wordprocessingDrawing" xmlns:w10="urn:schemas-microsoft-com:office:word" xmlns:w="http://schemas.openxmlformats.org/wordprocessingml/2006/main" xmlns:w14="http://schemas.microsoft.com/office/word/2010/wordml" xmlns:w15="http://schemas.microsoft.com/office/word/2012/wordml" xmlns:w16cex="http://schemas.microsoft.com/office/word/2018/wordml/cex" xmlns:w16cid="http://schemas.microsoft.com/office/word/2016/wordml/cid" xmlns:w16="http://schemas.microsoft.com/office/word/2018/wordml" xmlns:w16du="http://schemas.microsoft.com/office/word/2023/wordml/word16du" xmlns:w16sdtdh="http://schemas.microsoft.com/office/word/2020/wordml/sdtdatahash" xmlns:w16sdtfl="http://schemas.microsoft.com/office/word/2024/wordml/sdtformatlock" xmlns:w16se="http://schemas.microsoft.com/office/word/2015/wordml/symex" xmlns:wpg="http://schemas.microsoft.com/office/word/2010/wordprocessingGroup" xmlns:wpi="http://schemas.microsoft.com/office/word/2010/wordprocessingInk" xmlns:wne="http://schemas.microsoft.com/office/word/2006/wordml" xmlns:wps="http://schemas.microsoft.com/office/word/2010/wordprocessingShape" mc:Ignorable="w14 w15 w16se w16cid w16 w16cex w16sdtdh w16sdtfl cr w16du wp14">
-  <w16cex:commentExtensible w16cex:durableId="39B16711" w16cex:dateUtc="2025-12-01T12:54:00Z"/>
-  <w16cex:commentExtensible w16cex:durableId="251BBCC8" w16cex:dateUtc="2025-12-01T12:54:00Z"/>
-  <w16cex:commentExtensible w16cex:durableId="58E1F68E" w16cex:dateUtc="2025-12-01T13:10:00Z"/>
-  <w16cex:commentExtensible w16cex:durableId="62D6CC42" w16cex:dateUtc="2025-12-01T13:11:00Z"/>
-  <w16cex:commentExtensible w16cex:durableId="6635BCBF" w16cex:dateUtc="2025-12-01T13:11:00Z"/>
-</w16cex:commentsExtensible>
-</file>
-
-<file path=word/commentsIds.xml><?xml version="1.0" encoding="utf-8"?>
-<w16cid:commentsIds xmlns:wpc="http://schemas.microsoft.com/office/word/2010/wordprocessingCanvas" xmlns:cx="http://schemas.microsoft.com/office/drawing/2014/chartex" xmlns:cx1="http://schemas.microsoft.com/office/drawing/2015/9/8/chartex" xmlns:cx2="http://schemas.microsoft.com/office/drawing/2015/10/21/chartex" xmlns:cx3="http://schemas.microsoft.com/office/drawing/2016/5/9/chartex" xmlns:cx4="http://schemas.microsoft.com/office/drawing/2016/5/10/chartex" xmlns:cx5="http://schemas.microsoft.com/office/drawing/2016/5/11/chartex" xmlns:cx6="http://schemas.microsoft.com/office/drawing/2016/5/12/chartex" xmlns:cx7="http://schemas.microsoft.com/office/drawing/2016/5/13/chartex" xmlns:cx8="http://schemas.microsoft.com/office/drawing/2016/5/14/chartex" xmlns:mc="http://schemas.openxmlformats.org/markup-compatibility/2006" xmlns:aink="http://schemas.microsoft.com/office/drawing/2016/ink" xmlns:am3d="http://schemas.microsoft.com/office/drawing/2017/model3d" xmlns:o="urn:schemas-microsoft-com:office:office" xmlns:oel="http://schemas.microsoft.com/office/2019/extlst" xmlns:r="http://schemas.openxmlformats.org/officeDocument/2006/relationships" xmlns:m="http://schemas.openxmlformats.org/officeDocument/2006/math" xmlns:v="urn:schemas-microsoft-com:vml" xmlns:wp14="http://schemas.microsoft.com/office/word/2010/wordprocessingDrawing" xmlns:wp="http://schemas.openxmlformats.org/drawingml/2006/wordprocessingDrawing" xmlns:w10="urn:schemas-microsoft-com:office:word" xmlns:w="http://schemas.openxmlformats.org/wordprocessingml/2006/main" xmlns:w14="http://schemas.microsoft.com/office/word/2010/wordml" xmlns:w15="http://schemas.microsoft.com/office/word/2012/wordml" xmlns:w16cex="http://schemas.microsoft.com/office/word/2018/wordml/cex" xmlns:w16cid="http://schemas.microsoft.com/office/word/2016/wordml/cid" xmlns:w16="http://schemas.microsoft.com/office/word/2018/wordml" xmlns:w16du="http://schemas.microsoft.com/office/word/2023/wordml/word16du" xmlns:w16sdtdh="http://schemas.microsoft.com/office/word/2020/wordml/sdtdatahash" xmlns:w16sdtfl="http://schemas.microsoft.com/office/word/2024/wordml/sdtformatlock" xmlns:w16se="http://schemas.microsoft.com/office/word/2015/wordml/symex" xmlns:wpg="http://schemas.microsoft.com/office/word/2010/wordprocessingGroup" xmlns:wpi="http://schemas.microsoft.com/office/word/2010/wordprocessingInk" xmlns:wne="http://schemas.microsoft.com/office/word/2006/wordml" xmlns:wps="http://schemas.microsoft.com/office/word/2010/wordprocessingShape" mc:Ignorable="w14 w15 w16se w16cid w16 w16cex w16sdtdh w16sdtfl w16du wp14">
-  <w16cid:commentId w16cid:paraId="1992592D" w16cid:durableId="39B16711"/>
-  <w16cid:commentId w16cid:paraId="477C2B63" w16cid:durableId="251BBCC8"/>
-  <w16cid:commentId w16cid:paraId="3B53EF7D" w16cid:durableId="58E1F68E"/>
-  <w16cid:commentId w16cid:paraId="495CAA7D" w16cid:durableId="62D6CC42"/>
-  <w16cid:commentId w16cid:paraId="372A78E1" w16cid:durableId="6635BCBF"/>
-</w16cid:commentsIds>
-</file>
-
 <file path=word/endnotes.xml><?xml version="1.0" encoding="utf-8"?>
-<w:endnotes xmlns:wpc="http://schemas.microsoft.com/office/word/2010/wordprocessingCanvas" xmlns:cx="http://schemas.microsoft.com/office/drawing/2014/chartex" xmlns:cx1="http://schemas.microsoft.com/office/drawing/2015/9/8/chartex" xmlns:cx2="http://schemas.microsoft.com/office/drawing/2015/10/21/chartex" xmlns:cx3="http://schemas.microsoft.com/office/drawing/2016/5/9/chartex" xmlns:cx4="http://schemas.microsoft.com/office/drawing/2016/5/10/chartex" xmlns:cx5="http://schemas.microsoft.com/office/drawing/2016/5/11/chartex" xmlns:cx6="http://schemas.microsoft.com/office/drawing/2016/5/12/chartex" xmlns:cx7="http://schemas.microsoft.com/office/drawing/2016/5/13/chartex" xmlns:cx8="http://schemas.microsoft.com/office/drawing/2016/5/14/chartex" xmlns:mc="http://schemas.openxmlformats.org/markup-compatibility/2006" xmlns:aink="http://schemas.microsoft.com/office/drawing/2016/ink" xmlns:am3d="http://schemas.microsoft.com/office/drawing/2017/model3d" xmlns:o="urn:schemas-microsoft-com:office:office" xmlns:oel="http://schemas.microsoft.com/office/2019/extlst" xmlns:r="http://schemas.openxmlformats.org/officeDocument/2006/relationships" xmlns:m="http://schemas.openxmlformats.org/officeDocument/2006/math" xmlns:v="urn:schemas-microsoft-com:vml" xmlns:wp14="http://schemas.microsoft.com/office/word/2010/wordprocessingDrawing" xmlns:wp="http://schemas.openxmlformats.org/drawingml/2006/wordprocessingDrawing" xmlns:w10="urn:schemas-microsoft-com:office:word" xmlns:w="http://schemas.openxmlformats.org/wordprocessingml/2006/main" xmlns:w14="http://schemas.microsoft.com/office/word/2010/wordml" xmlns:w15="http://schemas.microsoft.com/office/word/2012/wordml" xmlns:w16cex="http://schemas.microsoft.com/office/word/2018/wordml/cex" xmlns:w16cid="http://schemas.microsoft.com/office/word/2016/wordml/cid" xmlns:w16="http://schemas.microsoft.com/office/word/2018/wordml" xmlns:w16du="http://schemas.microsoft.com/office/word/2023/wordml/word16du" xmlns:w16sdtdh="http://schemas.microsoft.com/office/word/2020/wordml/sdtdatahash" xmlns:w16sdtfl="http://schemas.microsoft.com/office/word/2024/wordml/sdtformatlock" xmlns:w16se="http://schemas.microsoft.com/office/word/2015/wordml/symex" xmlns:wpg="http://schemas.microsoft.com/office/word/2010/wordprocessingGroup" xmlns:wpi="http://schemas.microsoft.com/office/word/2010/wordprocessingInk" xmlns:wne="http://schemas.microsoft.com/office/word/2006/wordml" xmlns:wps="http://schemas.microsoft.com/office/word/2010/wordprocessingShape" mc:Ignorable="w14 w15 w16se w16cid w16 w16cex w16sdtdh w16sdtfl w16du wp14">
+<w:endnotes xmlns:wpc="http://schemas.microsoft.com/office/word/2010/wordprocessingCanvas" xmlns:cx="http://schemas.microsoft.com/office/drawing/2014/chartex" xmlns:cx1="http://schemas.microsoft.com/office/drawing/2015/9/8/chartex" xmlns:cx2="http://schemas.microsoft.com/office/drawing/2015/10/21/chartex" xmlns:cx3="http://schemas.microsoft.com/office/drawing/2016/5/9/chartex" xmlns:cx4="http://schemas.microsoft.com/office/drawing/2016/5/10/chartex" xmlns:cx5="http://schemas.microsoft.com/office/drawing/2016/5/11/chartex" xmlns:cx6="http://schemas.microsoft.com/office/drawing/2016/5/12/chartex" xmlns:cx7="http://schemas.microsoft.com/office/drawing/2016/5/13/chartex" xmlns:cx8="http://schemas.microsoft.com/office/drawing/2016/5/14/chartex" xmlns:mc="http://schemas.openxmlformats.org/markup-compatibility/2006" xmlns:aink="http://schemas.microsoft.com/office/drawing/2016/ink" xmlns:am3d="http://schemas.microsoft.com/office/drawing/2017/model3d" xmlns:o="urn:schemas-microsoft-com:office:office" xmlns:oel="http://schemas.microsoft.com/office/2019/extlst" xmlns:r="http://schemas.openxmlformats.org/officeDocument/2006/relationships" xmlns:m="http://schemas.openxmlformats.org/officeDocument/2006/math" xmlns:v="urn:schemas-microsoft-com:vml" xmlns:wp14="http://schemas.microsoft.com/office/word/2010/wordprocessingDrawing" xmlns:wp="http://schemas.openxmlformats.org/drawingml/2006/wordprocessingDrawing" xmlns:w10="urn:schemas-microsoft-com:office:word" xmlns:w="http://schemas.openxmlformats.org/wordprocessingml/2006/main" xmlns:w14="http://schemas.microsoft.com/office/word/2010/wordml" xmlns:w15="http://schemas.microsoft.com/office/word/2012/wordml" xmlns:w16cex="http://schemas.microsoft.com/office/word/2018/wordml/cex" xmlns:w16cid="http://schemas.microsoft.com/office/word/2016/wordml/cid" xmlns:w16="http://schemas.microsoft.com/office/word/2018/wordml" xmlns:w16sdtdh="http://schemas.microsoft.com/office/word/2020/wordml/sdtdatahash" xmlns:w16se="http://schemas.microsoft.com/office/word/2015/wordml/symex" xmlns:wpg="http://schemas.microsoft.com/office/word/2010/wordprocessingGroup" xmlns:wpi="http://schemas.microsoft.com/office/word/2010/wordprocessingInk" xmlns:wne="http://schemas.microsoft.com/office/word/2006/wordml" xmlns:wps="http://schemas.microsoft.com/office/word/2010/wordprocessingShape" mc:Ignorable="w14 w15 w16se w16cid w16 w16cex w16sdtdh wp14">
   <w:endnote w:type="separator" w:id="-1">
     <w:p>
       <w:r>
@@ -4040,20 +3819,20 @@
 </file>
 
 <file path=word/footer1.xml><?xml version="1.0" encoding="utf-8"?>
-<w:ftr xmlns:wpc="http://schemas.microsoft.com/office/word/2010/wordprocessingCanvas" xmlns:cx="http://schemas.microsoft.com/office/drawing/2014/chartex" xmlns:cx1="http://schemas.microsoft.com/office/drawing/2015/9/8/chartex" xmlns:cx2="http://schemas.microsoft.com/office/drawing/2015/10/21/chartex" xmlns:cx3="http://schemas.microsoft.com/office/drawing/2016/5/9/chartex" xmlns:cx4="http://schemas.microsoft.com/office/drawing/2016/5/10/chartex" xmlns:cx5="http://schemas.microsoft.com/office/drawing/2016/5/11/chartex" xmlns:cx6="http://schemas.microsoft.com/office/drawing/2016/5/12/chartex" xmlns:cx7="http://schemas.microsoft.com/office/drawing/2016/5/13/chartex" xmlns:cx8="http://schemas.microsoft.com/office/drawing/2016/5/14/chartex" xmlns:mc="http://schemas.openxmlformats.org/markup-compatibility/2006" xmlns:aink="http://schemas.microsoft.com/office/drawing/2016/ink" xmlns:am3d="http://schemas.microsoft.com/office/drawing/2017/model3d" xmlns:o="urn:schemas-microsoft-com:office:office" xmlns:oel="http://schemas.microsoft.com/office/2019/extlst" xmlns:r="http://schemas.openxmlformats.org/officeDocument/2006/relationships" xmlns:m="http://schemas.openxmlformats.org/officeDocument/2006/math" xmlns:v="urn:schemas-microsoft-com:vml" xmlns:wp14="http://schemas.microsoft.com/office/word/2010/wordprocessingDrawing" xmlns:wp="http://schemas.openxmlformats.org/drawingml/2006/wordprocessingDrawing" xmlns:w10="urn:schemas-microsoft-com:office:word" xmlns:w="http://schemas.openxmlformats.org/wordprocessingml/2006/main" xmlns:w14="http://schemas.microsoft.com/office/word/2010/wordml" xmlns:w15="http://schemas.microsoft.com/office/word/2012/wordml" xmlns:w16cex="http://schemas.microsoft.com/office/word/2018/wordml/cex" xmlns:w16cid="http://schemas.microsoft.com/office/word/2016/wordml/cid" xmlns:w16="http://schemas.microsoft.com/office/word/2018/wordml" xmlns:w16du="http://schemas.microsoft.com/office/word/2023/wordml/word16du" xmlns:w16sdtdh="http://schemas.microsoft.com/office/word/2020/wordml/sdtdatahash" xmlns:w16sdtfl="http://schemas.microsoft.com/office/word/2024/wordml/sdtformatlock" xmlns:w16se="http://schemas.microsoft.com/office/word/2015/wordml/symex" xmlns:wpg="http://schemas.microsoft.com/office/word/2010/wordprocessingGroup" xmlns:wpi="http://schemas.microsoft.com/office/word/2010/wordprocessingInk" xmlns:wne="http://schemas.microsoft.com/office/word/2006/wordml" xmlns:wps="http://schemas.microsoft.com/office/word/2010/wordprocessingShape" mc:Ignorable="w14 w15 w16se w16cid w16 w16cex w16sdtdh w16sdtfl w16du wp14">
+<w:ftr xmlns:wpc="http://schemas.microsoft.com/office/word/2010/wordprocessingCanvas" xmlns:cx="http://schemas.microsoft.com/office/drawing/2014/chartex" xmlns:cx1="http://schemas.microsoft.com/office/drawing/2015/9/8/chartex" xmlns:cx2="http://schemas.microsoft.com/office/drawing/2015/10/21/chartex" xmlns:cx3="http://schemas.microsoft.com/office/drawing/2016/5/9/chartex" xmlns:cx4="http://schemas.microsoft.com/office/drawing/2016/5/10/chartex" xmlns:cx5="http://schemas.microsoft.com/office/drawing/2016/5/11/chartex" xmlns:cx6="http://schemas.microsoft.com/office/drawing/2016/5/12/chartex" xmlns:cx7="http://schemas.microsoft.com/office/drawing/2016/5/13/chartex" xmlns:cx8="http://schemas.microsoft.com/office/drawing/2016/5/14/chartex" xmlns:mc="http://schemas.openxmlformats.org/markup-compatibility/2006" xmlns:aink="http://schemas.microsoft.com/office/drawing/2016/ink" xmlns:am3d="http://schemas.microsoft.com/office/drawing/2017/model3d" xmlns:o="urn:schemas-microsoft-com:office:office" xmlns:oel="http://schemas.microsoft.com/office/2019/extlst" xmlns:r="http://schemas.openxmlformats.org/officeDocument/2006/relationships" xmlns:m="http://schemas.openxmlformats.org/officeDocument/2006/math" xmlns:v="urn:schemas-microsoft-com:vml" xmlns:wp14="http://schemas.microsoft.com/office/word/2010/wordprocessingDrawing" xmlns:wp="http://schemas.openxmlformats.org/drawingml/2006/wordprocessingDrawing" xmlns:w10="urn:schemas-microsoft-com:office:word" xmlns:w="http://schemas.openxmlformats.org/wordprocessingml/2006/main" xmlns:w14="http://schemas.microsoft.com/office/word/2010/wordml" xmlns:w15="http://schemas.microsoft.com/office/word/2012/wordml" xmlns:w16cex="http://schemas.microsoft.com/office/word/2018/wordml/cex" xmlns:w16cid="http://schemas.microsoft.com/office/word/2016/wordml/cid" xmlns:w16="http://schemas.microsoft.com/office/word/2018/wordml" xmlns:w16sdtdh="http://schemas.microsoft.com/office/word/2020/wordml/sdtdatahash" xmlns:w16se="http://schemas.microsoft.com/office/word/2015/wordml/symex" xmlns:wpg="http://schemas.microsoft.com/office/word/2010/wordprocessingGroup" xmlns:wpi="http://schemas.microsoft.com/office/word/2010/wordprocessingInk" xmlns:wne="http://schemas.microsoft.com/office/word/2006/wordml" xmlns:wps="http://schemas.microsoft.com/office/word/2010/wordprocessingShape" mc:Ignorable="w14 w15 w16se w16cid w16 w16cex w16sdtdh wp14">
   <w:p>
     <w:pPr>
-      <w:pStyle w:val="Footer"/>
+      <w:pStyle w:val="Piedepgina"/>
     </w:pPr>
   </w:p>
 </w:ftr>
 </file>
 
 <file path=word/footer2.xml><?xml version="1.0" encoding="utf-8"?>
-<w:ftr xmlns:wpc="http://schemas.microsoft.com/office/word/2010/wordprocessingCanvas" xmlns:cx="http://schemas.microsoft.com/office/drawing/2014/chartex" xmlns:cx1="http://schemas.microsoft.com/office/drawing/2015/9/8/chartex" xmlns:cx2="http://schemas.microsoft.com/office/drawing/2015/10/21/chartex" xmlns:cx3="http://schemas.microsoft.com/office/drawing/2016/5/9/chartex" xmlns:cx4="http://schemas.microsoft.com/office/drawing/2016/5/10/chartex" xmlns:cx5="http://schemas.microsoft.com/office/drawing/2016/5/11/chartex" xmlns:cx6="http://schemas.microsoft.com/office/drawing/2016/5/12/chartex" xmlns:cx7="http://schemas.microsoft.com/office/drawing/2016/5/13/chartex" xmlns:cx8="http://schemas.microsoft.com/office/drawing/2016/5/14/chartex" xmlns:mc="http://schemas.openxmlformats.org/markup-compatibility/2006" xmlns:aink="http://schemas.microsoft.com/office/drawing/2016/ink" xmlns:am3d="http://schemas.microsoft.com/office/drawing/2017/model3d" xmlns:o="urn:schemas-microsoft-com:office:office" xmlns:oel="http://schemas.microsoft.com/office/2019/extlst" xmlns:r="http://schemas.openxmlformats.org/officeDocument/2006/relationships" xmlns:m="http://schemas.openxmlformats.org/officeDocument/2006/math" xmlns:v="urn:schemas-microsoft-com:vml" xmlns:wp14="http://schemas.microsoft.com/office/word/2010/wordprocessingDrawing" xmlns:wp="http://schemas.openxmlformats.org/drawingml/2006/wordprocessingDrawing" xmlns:w10="urn:schemas-microsoft-com:office:word" xmlns:w="http://schemas.openxmlformats.org/wordprocessingml/2006/main" xmlns:w14="http://schemas.microsoft.com/office/word/2010/wordml" xmlns:w15="http://schemas.microsoft.com/office/word/2012/wordml" xmlns:w16cex="http://schemas.microsoft.com/office/word/2018/wordml/cex" xmlns:w16cid="http://schemas.microsoft.com/office/word/2016/wordml/cid" xmlns:w16="http://schemas.microsoft.com/office/word/2018/wordml" xmlns:w16du="http://schemas.microsoft.com/office/word/2023/wordml/word16du" xmlns:w16sdtdh="http://schemas.microsoft.com/office/word/2020/wordml/sdtdatahash" xmlns:w16sdtfl="http://schemas.microsoft.com/office/word/2024/wordml/sdtformatlock" xmlns:w16se="http://schemas.microsoft.com/office/word/2015/wordml/symex" xmlns:wpg="http://schemas.microsoft.com/office/word/2010/wordprocessingGroup" xmlns:wpi="http://schemas.microsoft.com/office/word/2010/wordprocessingInk" xmlns:wne="http://schemas.microsoft.com/office/word/2006/wordml" xmlns:wps="http://schemas.microsoft.com/office/word/2010/wordprocessingShape" mc:Ignorable="w14 w15 w16se w16cid w16 w16cex w16sdtdh w16sdtfl w16du wp14">
+<w:ftr xmlns:wpc="http://schemas.microsoft.com/office/word/2010/wordprocessingCanvas" xmlns:cx="http://schemas.microsoft.com/office/drawing/2014/chartex" xmlns:cx1="http://schemas.microsoft.com/office/drawing/2015/9/8/chartex" xmlns:cx2="http://schemas.microsoft.com/office/drawing/2015/10/21/chartex" xmlns:cx3="http://schemas.microsoft.com/office/drawing/2016/5/9/chartex" xmlns:cx4="http://schemas.microsoft.com/office/drawing/2016/5/10/chartex" xmlns:cx5="http://schemas.microsoft.com/office/drawing/2016/5/11/chartex" xmlns:cx6="http://schemas.microsoft.com/office/drawing/2016/5/12/chartex" xmlns:cx7="http://schemas.microsoft.com/office/drawing/2016/5/13/chartex" xmlns:cx8="http://schemas.microsoft.com/office/drawing/2016/5/14/chartex" xmlns:mc="http://schemas.openxmlformats.org/markup-compatibility/2006" xmlns:aink="http://schemas.microsoft.com/office/drawing/2016/ink" xmlns:am3d="http://schemas.microsoft.com/office/drawing/2017/model3d" xmlns:o="urn:schemas-microsoft-com:office:office" xmlns:oel="http://schemas.microsoft.com/office/2019/extlst" xmlns:r="http://schemas.openxmlformats.org/officeDocument/2006/relationships" xmlns:m="http://schemas.openxmlformats.org/officeDocument/2006/math" xmlns:v="urn:schemas-microsoft-com:vml" xmlns:wp14="http://schemas.microsoft.com/office/word/2010/wordprocessingDrawing" xmlns:wp="http://schemas.openxmlformats.org/drawingml/2006/wordprocessingDrawing" xmlns:w10="urn:schemas-microsoft-com:office:word" xmlns:w="http://schemas.openxmlformats.org/wordprocessingml/2006/main" xmlns:w14="http://schemas.microsoft.com/office/word/2010/wordml" xmlns:w15="http://schemas.microsoft.com/office/word/2012/wordml" xmlns:w16cex="http://schemas.microsoft.com/office/word/2018/wordml/cex" xmlns:w16cid="http://schemas.microsoft.com/office/word/2016/wordml/cid" xmlns:w16="http://schemas.microsoft.com/office/word/2018/wordml" xmlns:w16sdtdh="http://schemas.microsoft.com/office/word/2020/wordml/sdtdatahash" xmlns:w16se="http://schemas.microsoft.com/office/word/2015/wordml/symex" xmlns:wpg="http://schemas.microsoft.com/office/word/2010/wordprocessingGroup" xmlns:wpi="http://schemas.microsoft.com/office/word/2010/wordprocessingInk" xmlns:wne="http://schemas.microsoft.com/office/word/2006/wordml" xmlns:wps="http://schemas.microsoft.com/office/word/2010/wordprocessingShape" mc:Ignorable="w14 w15 w16se w16cid w16 w16cex w16sdtdh wp14">
   <w:p>
     <w:pPr>
-      <w:pStyle w:val="Footer"/>
+      <w:pStyle w:val="Piedepgina"/>
       <w:spacing w:before="240" w:after="0"/>
       <w:jc w:val="right"/>
     </w:pPr>
@@ -4117,17 +3896,17 @@
 </file>
 
 <file path=word/footer3.xml><?xml version="1.0" encoding="utf-8"?>
-<w:ftr xmlns:wpc="http://schemas.microsoft.com/office/word/2010/wordprocessingCanvas" xmlns:cx="http://schemas.microsoft.com/office/drawing/2014/chartex" xmlns:cx1="http://schemas.microsoft.com/office/drawing/2015/9/8/chartex" xmlns:cx2="http://schemas.microsoft.com/office/drawing/2015/10/21/chartex" xmlns:cx3="http://schemas.microsoft.com/office/drawing/2016/5/9/chartex" xmlns:cx4="http://schemas.microsoft.com/office/drawing/2016/5/10/chartex" xmlns:cx5="http://schemas.microsoft.com/office/drawing/2016/5/11/chartex" xmlns:cx6="http://schemas.microsoft.com/office/drawing/2016/5/12/chartex" xmlns:cx7="http://schemas.microsoft.com/office/drawing/2016/5/13/chartex" xmlns:cx8="http://schemas.microsoft.com/office/drawing/2016/5/14/chartex" xmlns:mc="http://schemas.openxmlformats.org/markup-compatibility/2006" xmlns:aink="http://schemas.microsoft.com/office/drawing/2016/ink" xmlns:am3d="http://schemas.microsoft.com/office/drawing/2017/model3d" xmlns:o="urn:schemas-microsoft-com:office:office" xmlns:oel="http://schemas.microsoft.com/office/2019/extlst" xmlns:r="http://schemas.openxmlformats.org/officeDocument/2006/relationships" xmlns:m="http://schemas.openxmlformats.org/officeDocument/2006/math" xmlns:v="urn:schemas-microsoft-com:vml" xmlns:wp14="http://schemas.microsoft.com/office/word/2010/wordprocessingDrawing" xmlns:wp="http://schemas.openxmlformats.org/drawingml/2006/wordprocessingDrawing" xmlns:w10="urn:schemas-microsoft-com:office:word" xmlns:w="http://schemas.openxmlformats.org/wordprocessingml/2006/main" xmlns:w14="http://schemas.microsoft.com/office/word/2010/wordml" xmlns:w15="http://schemas.microsoft.com/office/word/2012/wordml" xmlns:w16cex="http://schemas.microsoft.com/office/word/2018/wordml/cex" xmlns:w16cid="http://schemas.microsoft.com/office/word/2016/wordml/cid" xmlns:w16="http://schemas.microsoft.com/office/word/2018/wordml" xmlns:w16du="http://schemas.microsoft.com/office/word/2023/wordml/word16du" xmlns:w16sdtdh="http://schemas.microsoft.com/office/word/2020/wordml/sdtdatahash" xmlns:w16sdtfl="http://schemas.microsoft.com/office/word/2024/wordml/sdtformatlock" xmlns:w16se="http://schemas.microsoft.com/office/word/2015/wordml/symex" xmlns:wpg="http://schemas.microsoft.com/office/word/2010/wordprocessingGroup" xmlns:wpi="http://schemas.microsoft.com/office/word/2010/wordprocessingInk" xmlns:wne="http://schemas.microsoft.com/office/word/2006/wordml" xmlns:wps="http://schemas.microsoft.com/office/word/2010/wordprocessingShape" mc:Ignorable="w14 w15 w16se w16cid w16 w16cex w16sdtdh w16sdtfl w16du wp14">
+<w:ftr xmlns:wpc="http://schemas.microsoft.com/office/word/2010/wordprocessingCanvas" xmlns:cx="http://schemas.microsoft.com/office/drawing/2014/chartex" xmlns:cx1="http://schemas.microsoft.com/office/drawing/2015/9/8/chartex" xmlns:cx2="http://schemas.microsoft.com/office/drawing/2015/10/21/chartex" xmlns:cx3="http://schemas.microsoft.com/office/drawing/2016/5/9/chartex" xmlns:cx4="http://schemas.microsoft.com/office/drawing/2016/5/10/chartex" xmlns:cx5="http://schemas.microsoft.com/office/drawing/2016/5/11/chartex" xmlns:cx6="http://schemas.microsoft.com/office/drawing/2016/5/12/chartex" xmlns:cx7="http://schemas.microsoft.com/office/drawing/2016/5/13/chartex" xmlns:cx8="http://schemas.microsoft.com/office/drawing/2016/5/14/chartex" xmlns:mc="http://schemas.openxmlformats.org/markup-compatibility/2006" xmlns:aink="http://schemas.microsoft.com/office/drawing/2016/ink" xmlns:am3d="http://schemas.microsoft.com/office/drawing/2017/model3d" xmlns:o="urn:schemas-microsoft-com:office:office" xmlns:oel="http://schemas.microsoft.com/office/2019/extlst" xmlns:r="http://schemas.openxmlformats.org/officeDocument/2006/relationships" xmlns:m="http://schemas.openxmlformats.org/officeDocument/2006/math" xmlns:v="urn:schemas-microsoft-com:vml" xmlns:wp14="http://schemas.microsoft.com/office/word/2010/wordprocessingDrawing" xmlns:wp="http://schemas.openxmlformats.org/drawingml/2006/wordprocessingDrawing" xmlns:w10="urn:schemas-microsoft-com:office:word" xmlns:w="http://schemas.openxmlformats.org/wordprocessingml/2006/main" xmlns:w14="http://schemas.microsoft.com/office/word/2010/wordml" xmlns:w15="http://schemas.microsoft.com/office/word/2012/wordml" xmlns:w16cex="http://schemas.microsoft.com/office/word/2018/wordml/cex" xmlns:w16cid="http://schemas.microsoft.com/office/word/2016/wordml/cid" xmlns:w16="http://schemas.microsoft.com/office/word/2018/wordml" xmlns:w16sdtdh="http://schemas.microsoft.com/office/word/2020/wordml/sdtdatahash" xmlns:w16se="http://schemas.microsoft.com/office/word/2015/wordml/symex" xmlns:wpg="http://schemas.microsoft.com/office/word/2010/wordprocessingGroup" xmlns:wpi="http://schemas.microsoft.com/office/word/2010/wordprocessingInk" xmlns:wne="http://schemas.microsoft.com/office/word/2006/wordml" xmlns:wps="http://schemas.microsoft.com/office/word/2010/wordprocessingShape" mc:Ignorable="w14 w15 w16se w16cid w16 w16cex w16sdtdh wp14">
   <w:p>
     <w:pPr>
-      <w:pStyle w:val="Footer"/>
+      <w:pStyle w:val="Piedepgina"/>
     </w:pPr>
   </w:p>
 </w:ftr>
 </file>
 
 <file path=word/footnotes.xml><?xml version="1.0" encoding="utf-8"?>
-<w:footnotes xmlns:wpc="http://schemas.microsoft.com/office/word/2010/wordprocessingCanvas" xmlns:cx="http://schemas.microsoft.com/office/drawing/2014/chartex" xmlns:cx1="http://schemas.microsoft.com/office/drawing/2015/9/8/chartex" xmlns:cx2="http://schemas.microsoft.com/office/drawing/2015/10/21/chartex" xmlns:cx3="http://schemas.microsoft.com/office/drawing/2016/5/9/chartex" xmlns:cx4="http://schemas.microsoft.com/office/drawing/2016/5/10/chartex" xmlns:cx5="http://schemas.microsoft.com/office/drawing/2016/5/11/chartex" xmlns:cx6="http://schemas.microsoft.com/office/drawing/2016/5/12/chartex" xmlns:cx7="http://schemas.microsoft.com/office/drawing/2016/5/13/chartex" xmlns:cx8="http://schemas.microsoft.com/office/drawing/2016/5/14/chartex" xmlns:mc="http://schemas.openxmlformats.org/markup-compatibility/2006" xmlns:aink="http://schemas.microsoft.com/office/drawing/2016/ink" xmlns:am3d="http://schemas.microsoft.com/office/drawing/2017/model3d" xmlns:o="urn:schemas-microsoft-com:office:office" xmlns:oel="http://schemas.microsoft.com/office/2019/extlst" xmlns:r="http://schemas.openxmlformats.org/officeDocument/2006/relationships" xmlns:m="http://schemas.openxmlformats.org/officeDocument/2006/math" xmlns:v="urn:schemas-microsoft-com:vml" xmlns:wp14="http://schemas.microsoft.com/office/word/2010/wordprocessingDrawing" xmlns:wp="http://schemas.openxmlformats.org/drawingml/2006/wordprocessingDrawing" xmlns:w10="urn:schemas-microsoft-com:office:word" xmlns:w="http://schemas.openxmlformats.org/wordprocessingml/2006/main" xmlns:w14="http://schemas.microsoft.com/office/word/2010/wordml" xmlns:w15="http://schemas.microsoft.com/office/word/2012/wordml" xmlns:w16cex="http://schemas.microsoft.com/office/word/2018/wordml/cex" xmlns:w16cid="http://schemas.microsoft.com/office/word/2016/wordml/cid" xmlns:w16="http://schemas.microsoft.com/office/word/2018/wordml" xmlns:w16du="http://schemas.microsoft.com/office/word/2023/wordml/word16du" xmlns:w16sdtdh="http://schemas.microsoft.com/office/word/2020/wordml/sdtdatahash" xmlns:w16sdtfl="http://schemas.microsoft.com/office/word/2024/wordml/sdtformatlock" xmlns:w16se="http://schemas.microsoft.com/office/word/2015/wordml/symex" xmlns:wpg="http://schemas.microsoft.com/office/word/2010/wordprocessingGroup" xmlns:wpi="http://schemas.microsoft.com/office/word/2010/wordprocessingInk" xmlns:wne="http://schemas.microsoft.com/office/word/2006/wordml" xmlns:wps="http://schemas.microsoft.com/office/word/2010/wordprocessingShape" mc:Ignorable="w14 w15 w16se w16cid w16 w16cex w16sdtdh w16sdtfl w16du wp14">
+<w:footnotes xmlns:wpc="http://schemas.microsoft.com/office/word/2010/wordprocessingCanvas" xmlns:cx="http://schemas.microsoft.com/office/drawing/2014/chartex" xmlns:cx1="http://schemas.microsoft.com/office/drawing/2015/9/8/chartex" xmlns:cx2="http://schemas.microsoft.com/office/drawing/2015/10/21/chartex" xmlns:cx3="http://schemas.microsoft.com/office/drawing/2016/5/9/chartex" xmlns:cx4="http://schemas.microsoft.com/office/drawing/2016/5/10/chartex" xmlns:cx5="http://schemas.microsoft.com/office/drawing/2016/5/11/chartex" xmlns:cx6="http://schemas.microsoft.com/office/drawing/2016/5/12/chartex" xmlns:cx7="http://schemas.microsoft.com/office/drawing/2016/5/13/chartex" xmlns:cx8="http://schemas.microsoft.com/office/drawing/2016/5/14/chartex" xmlns:mc="http://schemas.openxmlformats.org/markup-compatibility/2006" xmlns:aink="http://schemas.microsoft.com/office/drawing/2016/ink" xmlns:am3d="http://schemas.microsoft.com/office/drawing/2017/model3d" xmlns:o="urn:schemas-microsoft-com:office:office" xmlns:oel="http://schemas.microsoft.com/office/2019/extlst" xmlns:r="http://schemas.openxmlformats.org/officeDocument/2006/relationships" xmlns:m="http://schemas.openxmlformats.org/officeDocument/2006/math" xmlns:v="urn:schemas-microsoft-com:vml" xmlns:wp14="http://schemas.microsoft.com/office/word/2010/wordprocessingDrawing" xmlns:wp="http://schemas.openxmlformats.org/drawingml/2006/wordprocessingDrawing" xmlns:w10="urn:schemas-microsoft-com:office:word" xmlns:w="http://schemas.openxmlformats.org/wordprocessingml/2006/main" xmlns:w14="http://schemas.microsoft.com/office/word/2010/wordml" xmlns:w15="http://schemas.microsoft.com/office/word/2012/wordml" xmlns:w16cex="http://schemas.microsoft.com/office/word/2018/wordml/cex" xmlns:w16cid="http://schemas.microsoft.com/office/word/2016/wordml/cid" xmlns:w16="http://schemas.microsoft.com/office/word/2018/wordml" xmlns:w16sdtdh="http://schemas.microsoft.com/office/word/2020/wordml/sdtdatahash" xmlns:w16se="http://schemas.microsoft.com/office/word/2015/wordml/symex" xmlns:wpg="http://schemas.microsoft.com/office/word/2010/wordprocessingGroup" xmlns:wpi="http://schemas.microsoft.com/office/word/2010/wordprocessingInk" xmlns:wne="http://schemas.microsoft.com/office/word/2006/wordml" xmlns:wps="http://schemas.microsoft.com/office/word/2010/wordprocessingShape" mc:Ignorable="w14 w15 w16se w16cid w16 w16cex w16sdtdh wp14">
   <w:footnote w:type="separator" w:id="-1">
     <w:p>
       <w:pPr>
@@ -4174,20 +3953,20 @@
 </file>
 
 <file path=word/header1.xml><?xml version="1.0" encoding="utf-8"?>
-<w:hdr xmlns:wpc="http://schemas.microsoft.com/office/word/2010/wordprocessingCanvas" xmlns:cx="http://schemas.microsoft.com/office/drawing/2014/chartex" xmlns:cx1="http://schemas.microsoft.com/office/drawing/2015/9/8/chartex" xmlns:cx2="http://schemas.microsoft.com/office/drawing/2015/10/21/chartex" xmlns:cx3="http://schemas.microsoft.com/office/drawing/2016/5/9/chartex" xmlns:cx4="http://schemas.microsoft.com/office/drawing/2016/5/10/chartex" xmlns:cx5="http://schemas.microsoft.com/office/drawing/2016/5/11/chartex" xmlns:cx6="http://schemas.microsoft.com/office/drawing/2016/5/12/chartex" xmlns:cx7="http://schemas.microsoft.com/office/drawing/2016/5/13/chartex" xmlns:cx8="http://schemas.microsoft.com/office/drawing/2016/5/14/chartex" xmlns:mc="http://schemas.openxmlformats.org/markup-compatibility/2006" xmlns:aink="http://schemas.microsoft.com/office/drawing/2016/ink" xmlns:am3d="http://schemas.microsoft.com/office/drawing/2017/model3d" xmlns:o="urn:schemas-microsoft-com:office:office" xmlns:oel="http://schemas.microsoft.com/office/2019/extlst" xmlns:r="http://schemas.openxmlformats.org/officeDocument/2006/relationships" xmlns:m="http://schemas.openxmlformats.org/officeDocument/2006/math" xmlns:v="urn:schemas-microsoft-com:vml" xmlns:wp14="http://schemas.microsoft.com/office/word/2010/wordprocessingDrawing" xmlns:wp="http://schemas.openxmlformats.org/drawingml/2006/wordprocessingDrawing" xmlns:w10="urn:schemas-microsoft-com:office:word" xmlns:w="http://schemas.openxmlformats.org/wordprocessingml/2006/main" xmlns:w14="http://schemas.microsoft.com/office/word/2010/wordml" xmlns:w15="http://schemas.microsoft.com/office/word/2012/wordml" xmlns:w16cex="http://schemas.microsoft.com/office/word/2018/wordml/cex" xmlns:w16cid="http://schemas.microsoft.com/office/word/2016/wordml/cid" xmlns:w16="http://schemas.microsoft.com/office/word/2018/wordml" xmlns:w16du="http://schemas.microsoft.com/office/word/2023/wordml/word16du" xmlns:w16sdtdh="http://schemas.microsoft.com/office/word/2020/wordml/sdtdatahash" xmlns:w16sdtfl="http://schemas.microsoft.com/office/word/2024/wordml/sdtformatlock" xmlns:w16se="http://schemas.microsoft.com/office/word/2015/wordml/symex" xmlns:wpg="http://schemas.microsoft.com/office/word/2010/wordprocessingGroup" xmlns:wpi="http://schemas.microsoft.com/office/word/2010/wordprocessingInk" xmlns:wne="http://schemas.microsoft.com/office/word/2006/wordml" xmlns:wps="http://schemas.microsoft.com/office/word/2010/wordprocessingShape" mc:Ignorable="w14 w15 w16se w16cid w16 w16cex w16sdtdh w16sdtfl w16du wp14">
+<w:hdr xmlns:wpc="http://schemas.microsoft.com/office/word/2010/wordprocessingCanvas" xmlns:cx="http://schemas.microsoft.com/office/drawing/2014/chartex" xmlns:cx1="http://schemas.microsoft.com/office/drawing/2015/9/8/chartex" xmlns:cx2="http://schemas.microsoft.com/office/drawing/2015/10/21/chartex" xmlns:cx3="http://schemas.microsoft.com/office/drawing/2016/5/9/chartex" xmlns:cx4="http://schemas.microsoft.com/office/drawing/2016/5/10/chartex" xmlns:cx5="http://schemas.microsoft.com/office/drawing/2016/5/11/chartex" xmlns:cx6="http://schemas.microsoft.com/office/drawing/2016/5/12/chartex" xmlns:cx7="http://schemas.microsoft.com/office/drawing/2016/5/13/chartex" xmlns:cx8="http://schemas.microsoft.com/office/drawing/2016/5/14/chartex" xmlns:mc="http://schemas.openxmlformats.org/markup-compatibility/2006" xmlns:aink="http://schemas.microsoft.com/office/drawing/2016/ink" xmlns:am3d="http://schemas.microsoft.com/office/drawing/2017/model3d" xmlns:o="urn:schemas-microsoft-com:office:office" xmlns:oel="http://schemas.microsoft.com/office/2019/extlst" xmlns:r="http://schemas.openxmlformats.org/officeDocument/2006/relationships" xmlns:m="http://schemas.openxmlformats.org/officeDocument/2006/math" xmlns:v="urn:schemas-microsoft-com:vml" xmlns:wp14="http://schemas.microsoft.com/office/word/2010/wordprocessingDrawing" xmlns:wp="http://schemas.openxmlformats.org/drawingml/2006/wordprocessingDrawing" xmlns:w10="urn:schemas-microsoft-com:office:word" xmlns:w="http://schemas.openxmlformats.org/wordprocessingml/2006/main" xmlns:w14="http://schemas.microsoft.com/office/word/2010/wordml" xmlns:w15="http://schemas.microsoft.com/office/word/2012/wordml" xmlns:w16cex="http://schemas.microsoft.com/office/word/2018/wordml/cex" xmlns:w16cid="http://schemas.microsoft.com/office/word/2016/wordml/cid" xmlns:w16="http://schemas.microsoft.com/office/word/2018/wordml" xmlns:w16sdtdh="http://schemas.microsoft.com/office/word/2020/wordml/sdtdatahash" xmlns:w16se="http://schemas.microsoft.com/office/word/2015/wordml/symex" xmlns:wpg="http://schemas.microsoft.com/office/word/2010/wordprocessingGroup" xmlns:wpi="http://schemas.microsoft.com/office/word/2010/wordprocessingInk" xmlns:wne="http://schemas.microsoft.com/office/word/2006/wordml" xmlns:wps="http://schemas.microsoft.com/office/word/2010/wordprocessingShape" mc:Ignorable="w14 w15 w16se w16cid w16 w16cex w16sdtdh wp14">
   <w:p>
     <w:pPr>
-      <w:pStyle w:val="Header"/>
+      <w:pStyle w:val="Encabezado"/>
     </w:pPr>
   </w:p>
 </w:hdr>
 </file>
 
 <file path=word/header2.xml><?xml version="1.0" encoding="utf-8"?>
-<w:hdr xmlns:wpc="http://schemas.microsoft.com/office/word/2010/wordprocessingCanvas" xmlns:cx="http://schemas.microsoft.com/office/drawing/2014/chartex" xmlns:cx1="http://schemas.microsoft.com/office/drawing/2015/9/8/chartex" xmlns:cx2="http://schemas.microsoft.com/office/drawing/2015/10/21/chartex" xmlns:cx3="http://schemas.microsoft.com/office/drawing/2016/5/9/chartex" xmlns:cx4="http://schemas.microsoft.com/office/drawing/2016/5/10/chartex" xmlns:cx5="http://schemas.microsoft.com/office/drawing/2016/5/11/chartex" xmlns:cx6="http://schemas.microsoft.com/office/drawing/2016/5/12/chartex" xmlns:cx7="http://schemas.microsoft.com/office/drawing/2016/5/13/chartex" xmlns:cx8="http://schemas.microsoft.com/office/drawing/2016/5/14/chartex" xmlns:mc="http://schemas.openxmlformats.org/markup-compatibility/2006" xmlns:aink="http://schemas.microsoft.com/office/drawing/2016/ink" xmlns:am3d="http://schemas.microsoft.com/office/drawing/2017/model3d" xmlns:o="urn:schemas-microsoft-com:office:office" xmlns:oel="http://schemas.microsoft.com/office/2019/extlst" xmlns:r="http://schemas.openxmlformats.org/officeDocument/2006/relationships" xmlns:m="http://schemas.openxmlformats.org/officeDocument/2006/math" xmlns:v="urn:schemas-microsoft-com:vml" xmlns:wp14="http://schemas.microsoft.com/office/word/2010/wordprocessingDrawing" xmlns:wp="http://schemas.openxmlformats.org/drawingml/2006/wordprocessingDrawing" xmlns:w10="urn:schemas-microsoft-com:office:word" xmlns:w="http://schemas.openxmlformats.org/wordprocessingml/2006/main" xmlns:w14="http://schemas.microsoft.com/office/word/2010/wordml" xmlns:w15="http://schemas.microsoft.com/office/word/2012/wordml" xmlns:w16cex="http://schemas.microsoft.com/office/word/2018/wordml/cex" xmlns:w16cid="http://schemas.microsoft.com/office/word/2016/wordml/cid" xmlns:w16="http://schemas.microsoft.com/office/word/2018/wordml" xmlns:w16du="http://schemas.microsoft.com/office/word/2023/wordml/word16du" xmlns:w16sdtdh="http://schemas.microsoft.com/office/word/2020/wordml/sdtdatahash" xmlns:w16sdtfl="http://schemas.microsoft.com/office/word/2024/wordml/sdtformatlock" xmlns:w16se="http://schemas.microsoft.com/office/word/2015/wordml/symex" xmlns:wpg="http://schemas.microsoft.com/office/word/2010/wordprocessingGroup" xmlns:wpi="http://schemas.microsoft.com/office/word/2010/wordprocessingInk" xmlns:wne="http://schemas.microsoft.com/office/word/2006/wordml" xmlns:wps="http://schemas.microsoft.com/office/word/2010/wordprocessingShape" mc:Ignorable="w14 w15 w16se w16cid w16 w16cex w16sdtdh w16sdtfl w16du wp14">
+<w:hdr xmlns:wpc="http://schemas.microsoft.com/office/word/2010/wordprocessingCanvas" xmlns:cx="http://schemas.microsoft.com/office/drawing/2014/chartex" xmlns:cx1="http://schemas.microsoft.com/office/drawing/2015/9/8/chartex" xmlns:cx2="http://schemas.microsoft.com/office/drawing/2015/10/21/chartex" xmlns:cx3="http://schemas.microsoft.com/office/drawing/2016/5/9/chartex" xmlns:cx4="http://schemas.microsoft.com/office/drawing/2016/5/10/chartex" xmlns:cx5="http://schemas.microsoft.com/office/drawing/2016/5/11/chartex" xmlns:cx6="http://schemas.microsoft.com/office/drawing/2016/5/12/chartex" xmlns:cx7="http://schemas.microsoft.com/office/drawing/2016/5/13/chartex" xmlns:cx8="http://schemas.microsoft.com/office/drawing/2016/5/14/chartex" xmlns:mc="http://schemas.openxmlformats.org/markup-compatibility/2006" xmlns:aink="http://schemas.microsoft.com/office/drawing/2016/ink" xmlns:am3d="http://schemas.microsoft.com/office/drawing/2017/model3d" xmlns:o="urn:schemas-microsoft-com:office:office" xmlns:oel="http://schemas.microsoft.com/office/2019/extlst" xmlns:r="http://schemas.openxmlformats.org/officeDocument/2006/relationships" xmlns:m="http://schemas.openxmlformats.org/officeDocument/2006/math" xmlns:v="urn:schemas-microsoft-com:vml" xmlns:wp14="http://schemas.microsoft.com/office/word/2010/wordprocessingDrawing" xmlns:wp="http://schemas.openxmlformats.org/drawingml/2006/wordprocessingDrawing" xmlns:w10="urn:schemas-microsoft-com:office:word" xmlns:w="http://schemas.openxmlformats.org/wordprocessingml/2006/main" xmlns:w14="http://schemas.microsoft.com/office/word/2010/wordml" xmlns:w15="http://schemas.microsoft.com/office/word/2012/wordml" xmlns:w16cex="http://schemas.microsoft.com/office/word/2018/wordml/cex" xmlns:w16cid="http://schemas.microsoft.com/office/word/2016/wordml/cid" xmlns:w16="http://schemas.microsoft.com/office/word/2018/wordml" xmlns:w16sdtdh="http://schemas.microsoft.com/office/word/2020/wordml/sdtdatahash" xmlns:w16se="http://schemas.microsoft.com/office/word/2015/wordml/symex" xmlns:wpg="http://schemas.microsoft.com/office/word/2010/wordprocessingGroup" xmlns:wpi="http://schemas.microsoft.com/office/word/2010/wordprocessingInk" xmlns:wne="http://schemas.microsoft.com/office/word/2006/wordml" xmlns:wps="http://schemas.microsoft.com/office/word/2010/wordprocessingShape" mc:Ignorable="w14 w15 w16se w16cid w16 w16cex w16sdtdh wp14">
   <w:p>
     <w:pPr>
-      <w:pStyle w:val="Header"/>
+      <w:pStyle w:val="Encabezado"/>
       <w:jc w:val="right"/>
     </w:pPr>
     <w:r>
@@ -4241,17 +4020,17 @@
 </file>
 
 <file path=word/header3.xml><?xml version="1.0" encoding="utf-8"?>
-<w:hdr xmlns:wpc="http://schemas.microsoft.com/office/word/2010/wordprocessingCanvas" xmlns:cx="http://schemas.microsoft.com/office/drawing/2014/chartex" xmlns:cx1="http://schemas.microsoft.com/office/drawing/2015/9/8/chartex" xmlns:cx2="http://schemas.microsoft.com/office/drawing/2015/10/21/chartex" xmlns:cx3="http://schemas.microsoft.com/office/drawing/2016/5/9/chartex" xmlns:cx4="http://schemas.microsoft.com/office/drawing/2016/5/10/chartex" xmlns:cx5="http://schemas.microsoft.com/office/drawing/2016/5/11/chartex" xmlns:cx6="http://schemas.microsoft.com/office/drawing/2016/5/12/chartex" xmlns:cx7="http://schemas.microsoft.com/office/drawing/2016/5/13/chartex" xmlns:cx8="http://schemas.microsoft.com/office/drawing/2016/5/14/chartex" xmlns:mc="http://schemas.openxmlformats.org/markup-compatibility/2006" xmlns:aink="http://schemas.microsoft.com/office/drawing/2016/ink" xmlns:am3d="http://schemas.microsoft.com/office/drawing/2017/model3d" xmlns:o="urn:schemas-microsoft-com:office:office" xmlns:oel="http://schemas.microsoft.com/office/2019/extlst" xmlns:r="http://schemas.openxmlformats.org/officeDocument/2006/relationships" xmlns:m="http://schemas.openxmlformats.org/officeDocument/2006/math" xmlns:v="urn:schemas-microsoft-com:vml" xmlns:wp14="http://schemas.microsoft.com/office/word/2010/wordprocessingDrawing" xmlns:wp="http://schemas.openxmlformats.org/drawingml/2006/wordprocessingDrawing" xmlns:w10="urn:schemas-microsoft-com:office:word" xmlns:w="http://schemas.openxmlformats.org/wordprocessingml/2006/main" xmlns:w14="http://schemas.microsoft.com/office/word/2010/wordml" xmlns:w15="http://schemas.microsoft.com/office/word/2012/wordml" xmlns:w16cex="http://schemas.microsoft.com/office/word/2018/wordml/cex" xmlns:w16cid="http://schemas.microsoft.com/office/word/2016/wordml/cid" xmlns:w16="http://schemas.microsoft.com/office/word/2018/wordml" xmlns:w16du="http://schemas.microsoft.com/office/word/2023/wordml/word16du" xmlns:w16sdtdh="http://schemas.microsoft.com/office/word/2020/wordml/sdtdatahash" xmlns:w16sdtfl="http://schemas.microsoft.com/office/word/2024/wordml/sdtformatlock" xmlns:w16se="http://schemas.microsoft.com/office/word/2015/wordml/symex" xmlns:wpg="http://schemas.microsoft.com/office/word/2010/wordprocessingGroup" xmlns:wpi="http://schemas.microsoft.com/office/word/2010/wordprocessingInk" xmlns:wne="http://schemas.microsoft.com/office/word/2006/wordml" xmlns:wps="http://schemas.microsoft.com/office/word/2010/wordprocessingShape" mc:Ignorable="w14 w15 w16se w16cid w16 w16cex w16sdtdh w16sdtfl w16du wp14">
+<w:hdr xmlns:wpc="http://schemas.microsoft.com/office/word/2010/wordprocessingCanvas" xmlns:cx="http://schemas.microsoft.com/office/drawing/2014/chartex" xmlns:cx1="http://schemas.microsoft.com/office/drawing/2015/9/8/chartex" xmlns:cx2="http://schemas.microsoft.com/office/drawing/2015/10/21/chartex" xmlns:cx3="http://schemas.microsoft.com/office/drawing/2016/5/9/chartex" xmlns:cx4="http://schemas.microsoft.com/office/drawing/2016/5/10/chartex" xmlns:cx5="http://schemas.microsoft.com/office/drawing/2016/5/11/chartex" xmlns:cx6="http://schemas.microsoft.com/office/drawing/2016/5/12/chartex" xmlns:cx7="http://schemas.microsoft.com/office/drawing/2016/5/13/chartex" xmlns:cx8="http://schemas.microsoft.com/office/drawing/2016/5/14/chartex" xmlns:mc="http://schemas.openxmlformats.org/markup-compatibility/2006" xmlns:aink="http://schemas.microsoft.com/office/drawing/2016/ink" xmlns:am3d="http://schemas.microsoft.com/office/drawing/2017/model3d" xmlns:o="urn:schemas-microsoft-com:office:office" xmlns:oel="http://schemas.microsoft.com/office/2019/extlst" xmlns:r="http://schemas.openxmlformats.org/officeDocument/2006/relationships" xmlns:m="http://schemas.openxmlformats.org/officeDocument/2006/math" xmlns:v="urn:schemas-microsoft-com:vml" xmlns:wp14="http://schemas.microsoft.com/office/word/2010/wordprocessingDrawing" xmlns:wp="http://schemas.openxmlformats.org/drawingml/2006/wordprocessingDrawing" xmlns:w10="urn:schemas-microsoft-com:office:word" xmlns:w="http://schemas.openxmlformats.org/wordprocessingml/2006/main" xmlns:w14="http://schemas.microsoft.com/office/word/2010/wordml" xmlns:w15="http://schemas.microsoft.com/office/word/2012/wordml" xmlns:w16cex="http://schemas.microsoft.com/office/word/2018/wordml/cex" xmlns:w16cid="http://schemas.microsoft.com/office/word/2016/wordml/cid" xmlns:w16="http://schemas.microsoft.com/office/word/2018/wordml" xmlns:w16sdtdh="http://schemas.microsoft.com/office/word/2020/wordml/sdtdatahash" xmlns:w16se="http://schemas.microsoft.com/office/word/2015/wordml/symex" xmlns:wpg="http://schemas.microsoft.com/office/word/2010/wordprocessingGroup" xmlns:wpi="http://schemas.microsoft.com/office/word/2010/wordprocessingInk" xmlns:wne="http://schemas.microsoft.com/office/word/2006/wordml" xmlns:wps="http://schemas.microsoft.com/office/word/2010/wordprocessingShape" mc:Ignorable="w14 w15 w16se w16cid w16 w16cex w16sdtdh wp14">
   <w:p>
     <w:pPr>
-      <w:pStyle w:val="Header"/>
+      <w:pStyle w:val="Encabezado"/>
     </w:pPr>
   </w:p>
 </w:hdr>
 </file>
 
 <file path=word/numbering.xml><?xml version="1.0" encoding="utf-8"?>
-<w:numbering xmlns:wpc="http://schemas.microsoft.com/office/word/2010/wordprocessingCanvas" xmlns:cx="http://schemas.microsoft.com/office/drawing/2014/chartex" xmlns:cx1="http://schemas.microsoft.com/office/drawing/2015/9/8/chartex" xmlns:cx2="http://schemas.microsoft.com/office/drawing/2015/10/21/chartex" xmlns:cx3="http://schemas.microsoft.com/office/drawing/2016/5/9/chartex" xmlns:cx4="http://schemas.microsoft.com/office/drawing/2016/5/10/chartex" xmlns:cx5="http://schemas.microsoft.com/office/drawing/2016/5/11/chartex" xmlns:cx6="http://schemas.microsoft.com/office/drawing/2016/5/12/chartex" xmlns:cx7="http://schemas.microsoft.com/office/drawing/2016/5/13/chartex" xmlns:cx8="http://schemas.microsoft.com/office/drawing/2016/5/14/chartex" xmlns:mc="http://schemas.openxmlformats.org/markup-compatibility/2006" xmlns:aink="http://schemas.microsoft.com/office/drawing/2016/ink" xmlns:am3d="http://schemas.microsoft.com/office/drawing/2017/model3d" xmlns:o="urn:schemas-microsoft-com:office:office" xmlns:oel="http://schemas.microsoft.com/office/2019/extlst" xmlns:r="http://schemas.openxmlformats.org/officeDocument/2006/relationships" xmlns:m="http://schemas.openxmlformats.org/officeDocument/2006/math" xmlns:v="urn:schemas-microsoft-com:vml" xmlns:wp14="http://schemas.microsoft.com/office/word/2010/wordprocessingDrawing" xmlns:wp="http://schemas.openxmlformats.org/drawingml/2006/wordprocessingDrawing" xmlns:w10="urn:schemas-microsoft-com:office:word" xmlns:w="http://schemas.openxmlformats.org/wordprocessingml/2006/main" xmlns:w14="http://schemas.microsoft.com/office/word/2010/wordml" xmlns:w15="http://schemas.microsoft.com/office/word/2012/wordml" xmlns:w16cex="http://schemas.microsoft.com/office/word/2018/wordml/cex" xmlns:w16cid="http://schemas.microsoft.com/office/word/2016/wordml/cid" xmlns:w16="http://schemas.microsoft.com/office/word/2018/wordml" xmlns:w16du="http://schemas.microsoft.com/office/word/2023/wordml/word16du" xmlns:w16sdtdh="http://schemas.microsoft.com/office/word/2020/wordml/sdtdatahash" xmlns:w16sdtfl="http://schemas.microsoft.com/office/word/2024/wordml/sdtformatlock" xmlns:w16se="http://schemas.microsoft.com/office/word/2015/wordml/symex" xmlns:wpg="http://schemas.microsoft.com/office/word/2010/wordprocessingGroup" xmlns:wpi="http://schemas.microsoft.com/office/word/2010/wordprocessingInk" xmlns:wne="http://schemas.microsoft.com/office/word/2006/wordml" xmlns:wps="http://schemas.microsoft.com/office/word/2010/wordprocessingShape" mc:Ignorable="w14 w15 w16se w16cid w16 w16cex w16sdtdh w16sdtfl w16du wp14">
+<w:numbering xmlns:wpc="http://schemas.microsoft.com/office/word/2010/wordprocessingCanvas" xmlns:cx="http://schemas.microsoft.com/office/drawing/2014/chartex" xmlns:cx1="http://schemas.microsoft.com/office/drawing/2015/9/8/chartex" xmlns:cx2="http://schemas.microsoft.com/office/drawing/2015/10/21/chartex" xmlns:cx3="http://schemas.microsoft.com/office/drawing/2016/5/9/chartex" xmlns:cx4="http://schemas.microsoft.com/office/drawing/2016/5/10/chartex" xmlns:cx5="http://schemas.microsoft.com/office/drawing/2016/5/11/chartex" xmlns:cx6="http://schemas.microsoft.com/office/drawing/2016/5/12/chartex" xmlns:cx7="http://schemas.microsoft.com/office/drawing/2016/5/13/chartex" xmlns:cx8="http://schemas.microsoft.com/office/drawing/2016/5/14/chartex" xmlns:mc="http://schemas.openxmlformats.org/markup-compatibility/2006" xmlns:aink="http://schemas.microsoft.com/office/drawing/2016/ink" xmlns:am3d="http://schemas.microsoft.com/office/drawing/2017/model3d" xmlns:o="urn:schemas-microsoft-com:office:office" xmlns:oel="http://schemas.microsoft.com/office/2019/extlst" xmlns:r="http://schemas.openxmlformats.org/officeDocument/2006/relationships" xmlns:m="http://schemas.openxmlformats.org/officeDocument/2006/math" xmlns:v="urn:schemas-microsoft-com:vml" xmlns:wp14="http://schemas.microsoft.com/office/word/2010/wordprocessingDrawing" xmlns:wp="http://schemas.openxmlformats.org/drawingml/2006/wordprocessingDrawing" xmlns:w10="urn:schemas-microsoft-com:office:word" xmlns:w="http://schemas.openxmlformats.org/wordprocessingml/2006/main" xmlns:w14="http://schemas.microsoft.com/office/word/2010/wordml" xmlns:w15="http://schemas.microsoft.com/office/word/2012/wordml" xmlns:w16cex="http://schemas.microsoft.com/office/word/2018/wordml/cex" xmlns:w16cid="http://schemas.microsoft.com/office/word/2016/wordml/cid" xmlns:w16="http://schemas.microsoft.com/office/word/2018/wordml" xmlns:w16sdtdh="http://schemas.microsoft.com/office/word/2020/wordml/sdtdatahash" xmlns:w16se="http://schemas.microsoft.com/office/word/2015/wordml/symex" xmlns:wpg="http://schemas.microsoft.com/office/word/2010/wordprocessingGroup" xmlns:wpi="http://schemas.microsoft.com/office/word/2010/wordprocessingInk" xmlns:wne="http://schemas.microsoft.com/office/word/2006/wordml" xmlns:wps="http://schemas.microsoft.com/office/word/2010/wordprocessingShape" mc:Ignorable="w14 w15 w16se w16cid w16 w16cex w16sdtdh wp14">
   <w:abstractNum w:abstractNumId="0" w15:restartNumberingAfterBreak="0">
     <w:nsid w:val="04AB477D"/>
     <w:multiLevelType w:val="hybridMultilevel"/>
@@ -6589,7 +6368,7 @@
     <w:lvl w:ilvl="0">
       <w:start w:val="1"/>
       <w:numFmt w:val="upperRoman"/>
-      <w:pStyle w:val="Heading1"/>
+      <w:pStyle w:val="Ttulo1"/>
       <w:suff w:val="nothing"/>
       <w:lvlText w:val="Artículo %1"/>
       <w:lvlJc w:val="left"/>
@@ -6622,7 +6401,7 @@
     <w:lvl w:ilvl="1">
       <w:start w:val="1"/>
       <w:numFmt w:val="decimalZero"/>
-      <w:pStyle w:val="Heading2"/>
+      <w:pStyle w:val="Ttulo2"/>
       <w:isLgl/>
       <w:lvlText w:val="Sección %1.%2"/>
       <w:lvlJc w:val="left"/>
@@ -6655,7 +6434,7 @@
     <w:lvl w:ilvl="2">
       <w:start w:val="1"/>
       <w:numFmt w:val="lowerLetter"/>
-      <w:pStyle w:val="Heading3"/>
+      <w:pStyle w:val="Ttulo3"/>
       <w:lvlText w:val="(%3)"/>
       <w:lvlJc w:val="left"/>
       <w:pPr>
@@ -6692,7 +6471,7 @@
     <w:lvl w:ilvl="3">
       <w:start w:val="1"/>
       <w:numFmt w:val="lowerRoman"/>
-      <w:pStyle w:val="Heading4"/>
+      <w:pStyle w:val="Ttulo4"/>
       <w:lvlText w:val="(%4)"/>
       <w:lvlJc w:val="left"/>
       <w:pPr>
@@ -6722,7 +6501,7 @@
     <w:lvl w:ilvl="4">
       <w:start w:val="1"/>
       <w:numFmt w:val="decimal"/>
-      <w:pStyle w:val="Heading5"/>
+      <w:pStyle w:val="Ttulo5"/>
       <w:lvlText w:val="(%5)"/>
       <w:lvlJc w:val="left"/>
       <w:pPr>
@@ -6752,7 +6531,7 @@
     <w:lvl w:ilvl="5">
       <w:start w:val="1"/>
       <w:numFmt w:val="upperLetter"/>
-      <w:pStyle w:val="Heading6"/>
+      <w:pStyle w:val="Ttulo6"/>
       <w:suff w:val="nothing"/>
       <w:lvlText w:val="Anexo %6"/>
       <w:lvlJc w:val="left"/>
@@ -6783,7 +6562,7 @@
     <w:lvl w:ilvl="6">
       <w:start w:val="1"/>
       <w:numFmt w:val="lowerRoman"/>
-      <w:pStyle w:val="Heading7"/>
+      <w:pStyle w:val="Ttulo7"/>
       <w:lvlText w:val="%7)"/>
       <w:lvlJc w:val="right"/>
       <w:pPr>
@@ -6796,7 +6575,7 @@
     <w:lvl w:ilvl="7">
       <w:start w:val="1"/>
       <w:numFmt w:val="lowerLetter"/>
-      <w:pStyle w:val="Heading8"/>
+      <w:pStyle w:val="Ttulo8"/>
       <w:lvlText w:val="%8."/>
       <w:lvlJc w:val="left"/>
       <w:pPr>
@@ -6809,7 +6588,7 @@
     <w:lvl w:ilvl="8">
       <w:start w:val="1"/>
       <w:numFmt w:val="lowerRoman"/>
-      <w:pStyle w:val="Heading9"/>
+      <w:pStyle w:val="Ttulo9"/>
       <w:lvlText w:val="%9."/>
       <w:lvlJc w:val="right"/>
       <w:pPr>
@@ -7790,16 +7569,8 @@
 </w:numbering>
 </file>
 
-<file path=word/people.xml><?xml version="1.0" encoding="utf-8"?>
-<w15:people xmlns:wpc="http://schemas.microsoft.com/office/word/2010/wordprocessingCanvas" xmlns:cx="http://schemas.microsoft.com/office/drawing/2014/chartex" xmlns:cx1="http://schemas.microsoft.com/office/drawing/2015/9/8/chartex" xmlns:cx2="http://schemas.microsoft.com/office/drawing/2015/10/21/chartex" xmlns:cx3="http://schemas.microsoft.com/office/drawing/2016/5/9/chartex" xmlns:cx4="http://schemas.microsoft.com/office/drawing/2016/5/10/chartex" xmlns:cx5="http://schemas.microsoft.com/office/drawing/2016/5/11/chartex" xmlns:cx6="http://schemas.microsoft.com/office/drawing/2016/5/12/chartex" xmlns:cx7="http://schemas.microsoft.com/office/drawing/2016/5/13/chartex" xmlns:cx8="http://schemas.microsoft.com/office/drawing/2016/5/14/chartex" xmlns:mc="http://schemas.openxmlformats.org/markup-compatibility/2006" xmlns:aink="http://schemas.microsoft.com/office/drawing/2016/ink" xmlns:am3d="http://schemas.microsoft.com/office/drawing/2017/model3d" xmlns:o="urn:schemas-microsoft-com:office:office" xmlns:oel="http://schemas.microsoft.com/office/2019/extlst" xmlns:r="http://schemas.openxmlformats.org/officeDocument/2006/relationships" xmlns:m="http://schemas.openxmlformats.org/officeDocument/2006/math" xmlns:v="urn:schemas-microsoft-com:vml" xmlns:wp14="http://schemas.microsoft.com/office/word/2010/wordprocessingDrawing" xmlns:wp="http://schemas.openxmlformats.org/drawingml/2006/wordprocessingDrawing" xmlns:w10="urn:schemas-microsoft-com:office:word" xmlns:w="http://schemas.openxmlformats.org/wordprocessingml/2006/main" xmlns:w14="http://schemas.microsoft.com/office/word/2010/wordml" xmlns:w15="http://schemas.microsoft.com/office/word/2012/wordml" xmlns:w16cex="http://schemas.microsoft.com/office/word/2018/wordml/cex" xmlns:w16cid="http://schemas.microsoft.com/office/word/2016/wordml/cid" xmlns:w16="http://schemas.microsoft.com/office/word/2018/wordml" xmlns:w16du="http://schemas.microsoft.com/office/word/2023/wordml/word16du" xmlns:w16sdtdh="http://schemas.microsoft.com/office/word/2020/wordml/sdtdatahash" xmlns:w16sdtfl="http://schemas.microsoft.com/office/word/2024/wordml/sdtformatlock" xmlns:w16se="http://schemas.microsoft.com/office/word/2015/wordml/symex" xmlns:wpg="http://schemas.microsoft.com/office/word/2010/wordprocessingGroup" xmlns:wpi="http://schemas.microsoft.com/office/word/2010/wordprocessingInk" xmlns:wne="http://schemas.microsoft.com/office/word/2006/wordml" xmlns:wps="http://schemas.microsoft.com/office/word/2010/wordprocessingShape" mc:Ignorable="w14 w15 w16se w16cid w16 w16cex w16sdtdh w16sdtfl w16du wp14">
-  <w15:person w15:author="Sofia Tobon -FK">
-    <w15:presenceInfo w15:providerId="None" w15:userId="Sofia Tobon -FK"/>
-  </w15:person>
-</w15:people>
-</file>
-
 <file path=word/styles.xml><?xml version="1.0" encoding="utf-8"?>
-<w:styles xmlns:mc="http://schemas.openxmlformats.org/markup-compatibility/2006" xmlns:r="http://schemas.openxmlformats.org/officeDocument/2006/relationships" xmlns:w="http://schemas.openxmlformats.org/wordprocessingml/2006/main" xmlns:w14="http://schemas.microsoft.com/office/word/2010/wordml" xmlns:w15="http://schemas.microsoft.com/office/word/2012/wordml" xmlns:w16cex="http://schemas.microsoft.com/office/word/2018/wordml/cex" xmlns:w16cid="http://schemas.microsoft.com/office/word/2016/wordml/cid" xmlns:w16="http://schemas.microsoft.com/office/word/2018/wordml" xmlns:w16du="http://schemas.microsoft.com/office/word/2023/wordml/word16du" xmlns:w16sdtdh="http://schemas.microsoft.com/office/word/2020/wordml/sdtdatahash" xmlns:w16sdtfl="http://schemas.microsoft.com/office/word/2024/wordml/sdtformatlock" xmlns:w16se="http://schemas.microsoft.com/office/word/2015/wordml/symex" mc:Ignorable="w14 w15 w16se w16cid w16 w16cex w16sdtdh w16sdtfl w16du">
+<w:styles xmlns:mc="http://schemas.openxmlformats.org/markup-compatibility/2006" xmlns:r="http://schemas.openxmlformats.org/officeDocument/2006/relationships" xmlns:w="http://schemas.openxmlformats.org/wordprocessingml/2006/main" xmlns:w14="http://schemas.microsoft.com/office/word/2010/wordml" xmlns:w15="http://schemas.microsoft.com/office/word/2012/wordml" xmlns:w16cex="http://schemas.microsoft.com/office/word/2018/wordml/cex" xmlns:w16cid="http://schemas.microsoft.com/office/word/2016/wordml/cid" xmlns:w16="http://schemas.microsoft.com/office/word/2018/wordml" xmlns:w16sdtdh="http://schemas.microsoft.com/office/word/2020/wordml/sdtdatahash" xmlns:w16se="http://schemas.microsoft.com/office/word/2015/wordml/symex" mc:Ignorable="w14 w15 w16se w16cid w16 w16cex w16sdtdh">
   <w:docDefaults>
     <w:rPrDefault>
       <w:rPr>
@@ -8209,12 +7980,12 @@
       <w:lang w:eastAsia="es-CO"/>
     </w:rPr>
   </w:style>
-  <w:style w:type="paragraph" w:styleId="Heading1">
+  <w:style w:type="paragraph" w:styleId="Ttulo1">
     <w:name w:val="heading 1"/>
     <w:aliases w:val="H1,H1-Heading 1,Header 1,Heading 0,Hoofdstukkop,Legal Line 1,Lev 1,MT1,Niveau 1,SECTION,Section,Section Heading,Titulo 1,Título 1 Car,h1,head 1,l1,level 1,level1,título 1,título 11,título 111,título 112,título 12,título 13,título 14,título 15"/>
     <w:basedOn w:val="Normal"/>
     <w:next w:val="Normal"/>
-    <w:link w:val="Heading1Char"/>
+    <w:link w:val="Ttulo1Car1"/>
     <w:uiPriority w:val="9"/>
     <w:qFormat/>
     <w:rsid w:val="002E307E"/>
@@ -8231,12 +8002,12 @@
       <w:u w:val="single"/>
     </w:rPr>
   </w:style>
-  <w:style w:type="paragraph" w:styleId="Heading2">
+  <w:style w:type="paragraph" w:styleId="Ttulo2">
     <w:name w:val="heading 2"/>
     <w:aliases w:val="H2 Char,Subsección,Título 2 Car Car,Título 2 Car Car Car Car,Título 2 Car1,Título 2 Car1 Car Car,SECCIONES,BONUS-T2"/>
     <w:basedOn w:val="Normal"/>
     <w:next w:val="Normal"/>
-    <w:link w:val="Heading2Char"/>
+    <w:link w:val="Ttulo2Car"/>
     <w:uiPriority w:val="9"/>
     <w:unhideWhenUsed/>
     <w:qFormat/>
@@ -8254,12 +8025,12 @@
       <w:u w:val="single"/>
     </w:rPr>
   </w:style>
-  <w:style w:type="paragraph" w:styleId="Heading3">
+  <w:style w:type="paragraph" w:styleId="Ttulo3">
     <w:name w:val="heading 3"/>
     <w:aliases w:val="Style 46,BONUS-T3 Final,Edgar 3,1.1.1Título 3,Título 3-BCN,3 bullet,2,H3,1,1Título 3"/>
     <w:basedOn w:val="Normal"/>
     <w:next w:val="Normal"/>
-    <w:link w:val="Heading3Char"/>
+    <w:link w:val="Ttulo3Car"/>
     <w:unhideWhenUsed/>
     <w:qFormat/>
     <w:rsid w:val="00FA7061"/>
@@ -8275,11 +8046,11 @@
       <w:szCs w:val="22"/>
     </w:rPr>
   </w:style>
-  <w:style w:type="paragraph" w:styleId="Heading4">
+  <w:style w:type="paragraph" w:styleId="Ttulo4">
     <w:name w:val="heading 4"/>
     <w:basedOn w:val="Normal"/>
     <w:next w:val="Normal"/>
-    <w:link w:val="Heading4Char"/>
+    <w:link w:val="Ttulo4Car"/>
     <w:unhideWhenUsed/>
     <w:qFormat/>
     <w:rsid w:val="00FA7061"/>
@@ -8295,11 +8066,11 @@
       <w:iCs/>
     </w:rPr>
   </w:style>
-  <w:style w:type="paragraph" w:styleId="Heading5">
+  <w:style w:type="paragraph" w:styleId="Ttulo5">
     <w:name w:val="heading 5"/>
     <w:basedOn w:val="Normal"/>
     <w:next w:val="Normal"/>
-    <w:link w:val="Heading5Char"/>
+    <w:link w:val="Ttulo5Car"/>
     <w:unhideWhenUsed/>
     <w:qFormat/>
     <w:rsid w:val="00F42F36"/>
@@ -8314,12 +8085,12 @@
       <w:rFonts w:eastAsiaTheme="majorEastAsia" w:cstheme="majorBidi"/>
     </w:rPr>
   </w:style>
-  <w:style w:type="paragraph" w:styleId="Heading6">
+  <w:style w:type="paragraph" w:styleId="Ttulo6">
     <w:name w:val="heading 6"/>
     <w:aliases w:val="H6"/>
     <w:basedOn w:val="Normal"/>
     <w:next w:val="Normal"/>
-    <w:link w:val="Heading6Char"/>
+    <w:link w:val="Ttulo6Car"/>
     <w:uiPriority w:val="9"/>
     <w:unhideWhenUsed/>
     <w:qFormat/>
@@ -8336,11 +8107,11 @@
       <w:u w:val="single"/>
     </w:rPr>
   </w:style>
-  <w:style w:type="paragraph" w:styleId="Heading7">
+  <w:style w:type="paragraph" w:styleId="Ttulo7">
     <w:name w:val="heading 7"/>
     <w:basedOn w:val="Normal"/>
     <w:next w:val="Normal"/>
-    <w:link w:val="Heading7Char"/>
+    <w:link w:val="Ttulo7Car"/>
     <w:uiPriority w:val="9"/>
     <w:unhideWhenUsed/>
     <w:qFormat/>
@@ -8362,11 +8133,11 @@
       <w:color w:val="1F3763" w:themeColor="accent1" w:themeShade="7F"/>
     </w:rPr>
   </w:style>
-  <w:style w:type="paragraph" w:styleId="Heading8">
+  <w:style w:type="paragraph" w:styleId="Ttulo8">
     <w:name w:val="heading 8"/>
     <w:basedOn w:val="Normal"/>
     <w:next w:val="Normal"/>
-    <w:link w:val="Heading8Char"/>
+    <w:link w:val="Ttulo8Car"/>
     <w:uiPriority w:val="9"/>
     <w:unhideWhenUsed/>
     <w:qFormat/>
@@ -8388,11 +8159,11 @@
       <w:szCs w:val="21"/>
     </w:rPr>
   </w:style>
-  <w:style w:type="paragraph" w:styleId="Heading9">
+  <w:style w:type="paragraph" w:styleId="Ttulo9">
     <w:name w:val="heading 9"/>
     <w:basedOn w:val="Normal"/>
     <w:next w:val="Normal"/>
-    <w:link w:val="Heading9Char"/>
+    <w:link w:val="Ttulo9Car"/>
     <w:uiPriority w:val="9"/>
     <w:unhideWhenUsed/>
     <w:qFormat/>
@@ -8416,13 +8187,13 @@
       <w:szCs w:val="21"/>
     </w:rPr>
   </w:style>
-  <w:style w:type="character" w:default="1" w:styleId="DefaultParagraphFont">
+  <w:style w:type="character" w:default="1" w:styleId="Fuentedeprrafopredeter">
     <w:name w:val="Default Paragraph Font"/>
     <w:uiPriority w:val="1"/>
     <w:semiHidden/>
     <w:unhideWhenUsed/>
   </w:style>
-  <w:style w:type="table" w:default="1" w:styleId="TableNormal">
+  <w:style w:type="table" w:default="1" w:styleId="Tablanormal">
     <w:name w:val="Normal Table"/>
     <w:uiPriority w:val="99"/>
     <w:semiHidden/>
@@ -8437,17 +8208,17 @@
       </w:tblCellMar>
     </w:tblPr>
   </w:style>
-  <w:style w:type="numbering" w:default="1" w:styleId="NoList">
+  <w:style w:type="numbering" w:default="1" w:styleId="Sinlista">
     <w:name w:val="No List"/>
     <w:uiPriority w:val="99"/>
     <w:semiHidden/>
     <w:unhideWhenUsed/>
   </w:style>
-  <w:style w:type="character" w:customStyle="1" w:styleId="Heading1Char">
-    <w:name w:val="Heading 1 Char"/>
-    <w:aliases w:val="H1 Char,H1-Heading 1 Char,Header 1 Char,Heading 0 Char,Hoofdstukkop Char,Legal Line 1 Char,Lev 1 Char,MT1 Char,Niveau 1 Char,SECTION Char,Section Char,Section Heading Char,Titulo 1 Char,Título 1 Car Char,h1 Char,head 1 Char,l1 Char"/>
-    <w:basedOn w:val="DefaultParagraphFont"/>
-    <w:link w:val="Heading1"/>
+  <w:style w:type="character" w:customStyle="1" w:styleId="Ttulo1Car1">
+    <w:name w:val="Título 1 Car1"/>
+    <w:aliases w:val="H1 Car,H1-Heading 1 Car,Header 1 Car,Heading 0 Car,Hoofdstukkop Car,Legal Line 1 Car,Lev 1 Car,MT1 Car,Niveau 1 Car,SECTION Car,Section Car,Section Heading Car,Titulo 1 Car,Título 1 Car Car,h1 Car,head 1 Car,l1 Car,level 1 Car,level1 Car"/>
+    <w:basedOn w:val="Fuentedeprrafopredeter"/>
+    <w:link w:val="Ttulo1"/>
     <w:uiPriority w:val="9"/>
     <w:rsid w:val="002E307E"/>
     <w:rPr>
@@ -8458,11 +8229,11 @@
       <w:lang w:eastAsia="es-CO"/>
     </w:rPr>
   </w:style>
-  <w:style w:type="character" w:customStyle="1" w:styleId="Heading2Char">
-    <w:name w:val="Heading 2 Char"/>
-    <w:aliases w:val="H2 Char Char,Subsección Char,Título 2 Car Car Char,Título 2 Car Car Car Car Char,Título 2 Car1 Char,Título 2 Car1 Car Car Char,SECCIONES Char,BONUS-T2 Char"/>
-    <w:basedOn w:val="DefaultParagraphFont"/>
-    <w:link w:val="Heading2"/>
+  <w:style w:type="character" w:customStyle="1" w:styleId="Ttulo2Car">
+    <w:name w:val="Título 2 Car"/>
+    <w:aliases w:val="H2 Char Car,Subsección Car,Título 2 Car Car Car,Título 2 Car Car Car Car Car,Título 2 Car1 Car,Título 2 Car1 Car Car Car,SECCIONES Car,BONUS-T2 Car"/>
+    <w:basedOn w:val="Fuentedeprrafopredeter"/>
+    <w:link w:val="Ttulo2"/>
     <w:uiPriority w:val="9"/>
     <w:rsid w:val="002E307E"/>
     <w:rPr>
@@ -8472,21 +8243,21 @@
       <w:lang w:eastAsia="es-CO"/>
     </w:rPr>
   </w:style>
-  <w:style w:type="character" w:customStyle="1" w:styleId="Heading3Char">
-    <w:name w:val="Heading 3 Char"/>
-    <w:aliases w:val="Style 46 Char,BONUS-T3 Final Char,Edgar 3 Char,1.1.1Título 3 Char,Título 3-BCN Char,3 bullet Char,2 Char,H3 Char,1 Char,1Título 3 Char"/>
-    <w:basedOn w:val="DefaultParagraphFont"/>
-    <w:link w:val="Heading3"/>
+  <w:style w:type="character" w:customStyle="1" w:styleId="Ttulo3Car">
+    <w:name w:val="Título 3 Car"/>
+    <w:aliases w:val="Style 46 Car,BONUS-T3 Final Car,Edgar 3 Car,1.1.1Título 3 Car,Título 3-BCN Car,3 bullet Car,2 Car,H3 Car,1 Car,1Título 3 Car"/>
+    <w:basedOn w:val="Fuentedeprrafopredeter"/>
+    <w:link w:val="Ttulo3"/>
     <w:rsid w:val="00D7463D"/>
     <w:rPr>
       <w:rFonts w:ascii="Times New Roman" w:eastAsiaTheme="majorEastAsia" w:hAnsi="Times New Roman" w:cstheme="majorBidi"/>
       <w:lang w:eastAsia="es-CO"/>
     </w:rPr>
   </w:style>
-  <w:style w:type="character" w:customStyle="1" w:styleId="Heading4Char">
-    <w:name w:val="Heading 4 Char"/>
-    <w:basedOn w:val="DefaultParagraphFont"/>
-    <w:link w:val="Heading4"/>
+  <w:style w:type="character" w:customStyle="1" w:styleId="Ttulo4Car">
+    <w:name w:val="Título 4 Car"/>
+    <w:basedOn w:val="Fuentedeprrafopredeter"/>
+    <w:link w:val="Ttulo4"/>
     <w:rsid w:val="00A9517D"/>
     <w:rPr>
       <w:rFonts w:ascii="Times New Roman" w:eastAsiaTheme="majorEastAsia" w:hAnsi="Times New Roman" w:cstheme="majorBidi"/>
@@ -8495,10 +8266,10 @@
       <w:lang w:eastAsia="es-CO"/>
     </w:rPr>
   </w:style>
-  <w:style w:type="character" w:customStyle="1" w:styleId="Heading5Char">
-    <w:name w:val="Heading 5 Char"/>
-    <w:basedOn w:val="DefaultParagraphFont"/>
-    <w:link w:val="Heading5"/>
+  <w:style w:type="character" w:customStyle="1" w:styleId="Ttulo5Car">
+    <w:name w:val="Título 5 Car"/>
+    <w:basedOn w:val="Fuentedeprrafopredeter"/>
+    <w:link w:val="Ttulo5"/>
     <w:rsid w:val="00F42F36"/>
     <w:rPr>
       <w:rFonts w:ascii="Times New Roman" w:eastAsiaTheme="majorEastAsia" w:hAnsi="Times New Roman" w:cstheme="majorBidi"/>
@@ -8506,11 +8277,11 @@
       <w:lang w:eastAsia="es-CO"/>
     </w:rPr>
   </w:style>
-  <w:style w:type="character" w:customStyle="1" w:styleId="Heading6Char">
-    <w:name w:val="Heading 6 Char"/>
-    <w:aliases w:val="H6 Char"/>
-    <w:basedOn w:val="DefaultParagraphFont"/>
-    <w:link w:val="Heading6"/>
+  <w:style w:type="character" w:customStyle="1" w:styleId="Ttulo6Car">
+    <w:name w:val="Título 6 Car"/>
+    <w:aliases w:val="H6 Car"/>
+    <w:basedOn w:val="Fuentedeprrafopredeter"/>
+    <w:link w:val="Ttulo6"/>
     <w:uiPriority w:val="9"/>
     <w:rsid w:val="0054654C"/>
     <w:rPr>
@@ -8520,10 +8291,10 @@
       <w:lang w:eastAsia="es-CO"/>
     </w:rPr>
   </w:style>
-  <w:style w:type="character" w:customStyle="1" w:styleId="Heading7Char">
-    <w:name w:val="Heading 7 Char"/>
-    <w:basedOn w:val="DefaultParagraphFont"/>
-    <w:link w:val="Heading7"/>
+  <w:style w:type="character" w:customStyle="1" w:styleId="Ttulo7Car">
+    <w:name w:val="Título 7 Car"/>
+    <w:basedOn w:val="Fuentedeprrafopredeter"/>
+    <w:link w:val="Ttulo7"/>
     <w:uiPriority w:val="9"/>
     <w:rsid w:val="00542D01"/>
     <w:rPr>
@@ -8535,10 +8306,10 @@
       <w:lang w:eastAsia="es-CO"/>
     </w:rPr>
   </w:style>
-  <w:style w:type="character" w:customStyle="1" w:styleId="Heading8Char">
-    <w:name w:val="Heading 8 Char"/>
-    <w:basedOn w:val="DefaultParagraphFont"/>
-    <w:link w:val="Heading8"/>
+  <w:style w:type="character" w:customStyle="1" w:styleId="Ttulo8Car">
+    <w:name w:val="Título 8 Car"/>
+    <w:basedOn w:val="Fuentedeprrafopredeter"/>
+    <w:link w:val="Ttulo8"/>
     <w:uiPriority w:val="9"/>
     <w:rsid w:val="00542D01"/>
     <w:rPr>
@@ -8549,10 +8320,10 @@
       <w:lang w:eastAsia="es-CO"/>
     </w:rPr>
   </w:style>
-  <w:style w:type="character" w:customStyle="1" w:styleId="Heading9Char">
-    <w:name w:val="Heading 9 Char"/>
-    <w:basedOn w:val="DefaultParagraphFont"/>
-    <w:link w:val="Heading9"/>
+  <w:style w:type="character" w:customStyle="1" w:styleId="Ttulo9Car">
+    <w:name w:val="Título 9 Car"/>
+    <w:basedOn w:val="Fuentedeprrafopredeter"/>
+    <w:link w:val="Ttulo9"/>
     <w:uiPriority w:val="9"/>
     <w:rsid w:val="00542D01"/>
     <w:rPr>
@@ -8565,10 +8336,10 @@
       <w:lang w:eastAsia="es-CO"/>
     </w:rPr>
   </w:style>
-  <w:style w:type="paragraph" w:styleId="Header">
+  <w:style w:type="paragraph" w:styleId="Encabezado">
     <w:name w:val="header"/>
     <w:basedOn w:val="Normal"/>
-    <w:link w:val="HeaderChar"/>
+    <w:link w:val="EncabezadoCar"/>
     <w:uiPriority w:val="99"/>
     <w:unhideWhenUsed/>
     <w:rsid w:val="00542D01"/>
@@ -8579,10 +8350,10 @@
       </w:tabs>
     </w:pPr>
   </w:style>
-  <w:style w:type="character" w:customStyle="1" w:styleId="HeaderChar">
-    <w:name w:val="Header Char"/>
-    <w:basedOn w:val="DefaultParagraphFont"/>
-    <w:link w:val="Header"/>
+  <w:style w:type="character" w:customStyle="1" w:styleId="EncabezadoCar">
+    <w:name w:val="Encabezado Car"/>
+    <w:basedOn w:val="Fuentedeprrafopredeter"/>
+    <w:link w:val="Encabezado"/>
     <w:uiPriority w:val="99"/>
     <w:rsid w:val="00542D01"/>
     <w:rPr>
@@ -8592,10 +8363,10 @@
       <w:lang w:eastAsia="es-CO"/>
     </w:rPr>
   </w:style>
-  <w:style w:type="paragraph" w:styleId="Footer">
+  <w:style w:type="paragraph" w:styleId="Piedepgina">
     <w:name w:val="footer"/>
     <w:basedOn w:val="Normal"/>
-    <w:link w:val="FooterChar"/>
+    <w:link w:val="PiedepginaCar"/>
     <w:uiPriority w:val="99"/>
     <w:unhideWhenUsed/>
     <w:rsid w:val="00542D01"/>
@@ -8606,10 +8377,10 @@
       </w:tabs>
     </w:pPr>
   </w:style>
-  <w:style w:type="character" w:customStyle="1" w:styleId="FooterChar">
-    <w:name w:val="Footer Char"/>
-    <w:basedOn w:val="DefaultParagraphFont"/>
-    <w:link w:val="Footer"/>
+  <w:style w:type="character" w:customStyle="1" w:styleId="PiedepginaCar">
+    <w:name w:val="Pie de página Car"/>
+    <w:basedOn w:val="Fuentedeprrafopredeter"/>
+    <w:link w:val="Piedepgina"/>
     <w:uiPriority w:val="99"/>
     <w:rsid w:val="00542D01"/>
     <w:rPr>
@@ -8619,9 +8390,9 @@
       <w:lang w:eastAsia="es-CO"/>
     </w:rPr>
   </w:style>
-  <w:style w:type="character" w:styleId="IntenseReference">
+  <w:style w:type="character" w:styleId="Referenciaintensa">
     <w:name w:val="Intense Reference"/>
-    <w:basedOn w:val="PageNumber"/>
+    <w:basedOn w:val="Nmerodepgina"/>
     <w:uiPriority w:val="32"/>
     <w:qFormat/>
     <w:rsid w:val="00542D01"/>
@@ -8633,17 +8404,17 @@
       <w:color w:val="70AD47" w:themeColor="accent6"/>
     </w:rPr>
   </w:style>
-  <w:style w:type="character" w:styleId="PageNumber">
+  <w:style w:type="character" w:styleId="Nmerodepgina">
     <w:name w:val="page number"/>
-    <w:basedOn w:val="DefaultParagraphFont"/>
+    <w:basedOn w:val="Fuentedeprrafopredeter"/>
     <w:uiPriority w:val="99"/>
     <w:semiHidden/>
     <w:unhideWhenUsed/>
     <w:rsid w:val="00542D01"/>
   </w:style>
-  <w:style w:type="character" w:styleId="SubtleReference">
+  <w:style w:type="character" w:styleId="Referenciasutil">
     <w:name w:val="Subtle Reference"/>
-    <w:basedOn w:val="DefaultParagraphFont"/>
+    <w:basedOn w:val="Fuentedeprrafopredeter"/>
     <w:uiPriority w:val="31"/>
     <w:qFormat/>
     <w:rsid w:val="00542D01"/>
@@ -8654,20 +8425,20 @@
       <w:sz w:val="14"/>
     </w:rPr>
   </w:style>
-  <w:style w:type="paragraph" w:styleId="BodyText">
+  <w:style w:type="paragraph" w:styleId="Textoindependiente">
     <w:name w:val="Body Text"/>
     <w:basedOn w:val="Normal"/>
-    <w:link w:val="BodyTextChar"/>
+    <w:link w:val="TextoindependienteCar"/>
     <w:rsid w:val="00542D01"/>
     <w:rPr>
       <w:szCs w:val="20"/>
       <w:lang w:val="es-MX"/>
     </w:rPr>
   </w:style>
-  <w:style w:type="character" w:customStyle="1" w:styleId="BodyTextChar">
-    <w:name w:val="Body Text Char"/>
-    <w:basedOn w:val="DefaultParagraphFont"/>
-    <w:link w:val="BodyText"/>
+  <w:style w:type="character" w:customStyle="1" w:styleId="TextoindependienteCar">
+    <w:name w:val="Texto independiente Car"/>
+    <w:basedOn w:val="Fuentedeprrafopredeter"/>
+    <w:link w:val="Textoindependiente"/>
     <w:rsid w:val="00542D01"/>
     <w:rPr>
       <w:rFonts w:ascii="Georgia" w:eastAsia="Times New Roman" w:hAnsi="Georgia" w:cs="Times New Roman"/>
@@ -8676,11 +8447,11 @@
       <w:lang w:val="es-MX" w:eastAsia="es-CO"/>
     </w:rPr>
   </w:style>
-  <w:style w:type="paragraph" w:styleId="ListParagraph">
+  <w:style w:type="paragraph" w:styleId="Prrafodelista">
     <w:name w:val="List Paragraph"/>
     <w:aliases w:val="Título1,Colorful List - Accent 11,Bolita,Párrafo antic,BOLADEF,Párrafo de lista2,Párrafo de lista3,Párrafo de lista21,BOLA,1. Anexo,Colorful List Accent 1,EY EPM - Lista,Estilo 3,Guión,HOJA,Lista vistosa - Énfasis 11,NORMAL,Titulo 8"/>
     <w:basedOn w:val="Normal"/>
-    <w:link w:val="ListParagraphChar"/>
+    <w:link w:val="PrrafodelistaCar"/>
     <w:uiPriority w:val="1"/>
     <w:qFormat/>
     <w:rsid w:val="00542D01"/>
@@ -8689,10 +8460,10 @@
       <w:contextualSpacing/>
     </w:pPr>
   </w:style>
-  <w:style w:type="character" w:customStyle="1" w:styleId="BodyText2Char">
-    <w:name w:val="Body Text 2 Char"/>
-    <w:basedOn w:val="DefaultParagraphFont"/>
-    <w:link w:val="BodyText2"/>
+  <w:style w:type="character" w:customStyle="1" w:styleId="Textoindependiente2Car">
+    <w:name w:val="Texto independiente 2 Car"/>
+    <w:basedOn w:val="Fuentedeprrafopredeter"/>
+    <w:link w:val="Textoindependiente2"/>
     <w:uiPriority w:val="99"/>
     <w:semiHidden/>
     <w:rsid w:val="00542D01"/>
@@ -8703,10 +8474,10 @@
       <w:lang w:eastAsia="es-CO"/>
     </w:rPr>
   </w:style>
-  <w:style w:type="paragraph" w:styleId="BodyText2">
+  <w:style w:type="paragraph" w:styleId="Textoindependiente2">
     <w:name w:val="Body Text 2"/>
     <w:basedOn w:val="Normal"/>
-    <w:link w:val="BodyText2Char"/>
+    <w:link w:val="Textoindependiente2Car"/>
     <w:uiPriority w:val="99"/>
     <w:semiHidden/>
     <w:unhideWhenUsed/>
@@ -8717,7 +8488,7 @@
   </w:style>
   <w:style w:type="character" w:customStyle="1" w:styleId="Textoindependiente2Car1">
     <w:name w:val="Texto independiente 2 Car1"/>
-    <w:basedOn w:val="DefaultParagraphFont"/>
+    <w:basedOn w:val="Fuentedeprrafopredeter"/>
     <w:uiPriority w:val="99"/>
     <w:semiHidden/>
     <w:rsid w:val="00542D01"/>
@@ -8728,10 +8499,10 @@
       <w:lang w:eastAsia="es-CO"/>
     </w:rPr>
   </w:style>
-  <w:style w:type="character" w:customStyle="1" w:styleId="CommentTextChar">
-    <w:name w:val="Comment Text Char"/>
-    <w:basedOn w:val="DefaultParagraphFont"/>
-    <w:link w:val="CommentText"/>
+  <w:style w:type="character" w:customStyle="1" w:styleId="TextocomentarioCar">
+    <w:name w:val="Texto comentario Car"/>
+    <w:basedOn w:val="Fuentedeprrafopredeter"/>
+    <w:link w:val="Textocomentario"/>
     <w:uiPriority w:val="99"/>
     <w:rsid w:val="00542D01"/>
     <w:rPr>
@@ -8741,10 +8512,10 @@
       <w:lang w:eastAsia="es-ES"/>
     </w:rPr>
   </w:style>
-  <w:style w:type="paragraph" w:styleId="CommentText">
+  <w:style w:type="paragraph" w:styleId="Textocomentario">
     <w:name w:val="annotation text"/>
     <w:basedOn w:val="Normal"/>
-    <w:link w:val="CommentTextChar"/>
+    <w:link w:val="TextocomentarioCar"/>
     <w:uiPriority w:val="99"/>
     <w:unhideWhenUsed/>
     <w:rsid w:val="00542D01"/>
@@ -8755,7 +8526,7 @@
   </w:style>
   <w:style w:type="character" w:customStyle="1" w:styleId="TextocomentarioCar1">
     <w:name w:val="Texto comentario Car1"/>
-    <w:basedOn w:val="DefaultParagraphFont"/>
+    <w:basedOn w:val="Fuentedeprrafopredeter"/>
     <w:uiPriority w:val="99"/>
     <w:semiHidden/>
     <w:rsid w:val="00542D01"/>
@@ -8766,10 +8537,10 @@
       <w:lang w:eastAsia="es-CO"/>
     </w:rPr>
   </w:style>
-  <w:style w:type="character" w:customStyle="1" w:styleId="BalloonTextChar">
-    <w:name w:val="Balloon Text Char"/>
-    <w:basedOn w:val="DefaultParagraphFont"/>
-    <w:link w:val="BalloonText"/>
+  <w:style w:type="character" w:customStyle="1" w:styleId="TextodegloboCar">
+    <w:name w:val="Texto de globo Car"/>
+    <w:basedOn w:val="Fuentedeprrafopredeter"/>
+    <w:link w:val="Textodeglobo"/>
     <w:uiPriority w:val="99"/>
     <w:semiHidden/>
     <w:rsid w:val="00542D01"/>
@@ -8780,10 +8551,10 @@
       <w:lang w:eastAsia="es-CO"/>
     </w:rPr>
   </w:style>
-  <w:style w:type="paragraph" w:styleId="BalloonText">
+  <w:style w:type="paragraph" w:styleId="Textodeglobo">
     <w:name w:val="Balloon Text"/>
     <w:basedOn w:val="Normal"/>
-    <w:link w:val="BalloonTextChar"/>
+    <w:link w:val="TextodegloboCar"/>
     <w:uiPriority w:val="99"/>
     <w:semiHidden/>
     <w:unhideWhenUsed/>
@@ -8796,7 +8567,7 @@
   </w:style>
   <w:style w:type="character" w:customStyle="1" w:styleId="TextodegloboCar1">
     <w:name w:val="Texto de globo Car1"/>
-    <w:basedOn w:val="DefaultParagraphFont"/>
+    <w:basedOn w:val="Fuentedeprrafopredeter"/>
     <w:uiPriority w:val="99"/>
     <w:semiHidden/>
     <w:rsid w:val="00542D01"/>
@@ -8807,11 +8578,11 @@
       <w:lang w:eastAsia="es-CO"/>
     </w:rPr>
   </w:style>
-  <w:style w:type="paragraph" w:styleId="Title">
+  <w:style w:type="paragraph" w:styleId="Ttulo">
     <w:name w:val="Title"/>
     <w:basedOn w:val="Normal"/>
     <w:next w:val="Normal"/>
-    <w:link w:val="TitleChar"/>
+    <w:link w:val="TtuloCar"/>
     <w:uiPriority w:val="10"/>
     <w:qFormat/>
     <w:rsid w:val="00542D01"/>
@@ -8828,10 +8599,10 @@
       <w:szCs w:val="56"/>
     </w:rPr>
   </w:style>
-  <w:style w:type="character" w:customStyle="1" w:styleId="TitleChar">
-    <w:name w:val="Title Char"/>
-    <w:basedOn w:val="DefaultParagraphFont"/>
-    <w:link w:val="Title"/>
+  <w:style w:type="character" w:customStyle="1" w:styleId="TtuloCar">
+    <w:name w:val="Título Car"/>
+    <w:basedOn w:val="Fuentedeprrafopredeter"/>
+    <w:link w:val="Ttulo"/>
     <w:uiPriority w:val="10"/>
     <w:rsid w:val="00542D01"/>
     <w:rPr>
@@ -8844,9 +8615,9 @@
       <w:lang w:eastAsia="es-CO"/>
     </w:rPr>
   </w:style>
-  <w:style w:type="table" w:styleId="TableGrid">
+  <w:style w:type="table" w:styleId="Tablaconcuadrcula">
     <w:name w:val="Table Grid"/>
-    <w:basedOn w:val="TableNormal"/>
+    <w:basedOn w:val="Tablanormal"/>
     <w:uiPriority w:val="39"/>
     <w:rsid w:val="00542D01"/>
     <w:pPr>
@@ -8867,9 +8638,9 @@
       </w:tblBorders>
     </w:tblPr>
   </w:style>
-  <w:style w:type="paragraph" w:styleId="TOCHeading">
+  <w:style w:type="paragraph" w:styleId="TtuloTDC">
     <w:name w:val="TOC Heading"/>
-    <w:basedOn w:val="Heading1"/>
+    <w:basedOn w:val="Ttulo1"/>
     <w:next w:val="Normal"/>
     <w:uiPriority w:val="39"/>
     <w:unhideWhenUsed/>
@@ -8892,7 +8663,7 @@
       <w:lang w:val="es-MX" w:eastAsia="es-MX"/>
     </w:rPr>
   </w:style>
-  <w:style w:type="paragraph" w:styleId="TOC3">
+  <w:style w:type="paragraph" w:styleId="TDC3">
     <w:name w:val="toc 3"/>
     <w:basedOn w:val="Normal"/>
     <w:next w:val="Normal"/>
@@ -8905,7 +8676,7 @@
       <w:ind w:left="480"/>
     </w:pPr>
   </w:style>
-  <w:style w:type="paragraph" w:styleId="TOC1">
+  <w:style w:type="paragraph" w:styleId="TDC1">
     <w:name w:val="toc 1"/>
     <w:basedOn w:val="Normal"/>
     <w:next w:val="Normal"/>
@@ -8921,7 +8692,7 @@
       <w:jc w:val="center"/>
     </w:pPr>
   </w:style>
-  <w:style w:type="paragraph" w:styleId="TOC2">
+  <w:style w:type="paragraph" w:styleId="TDC2">
     <w:name w:val="toc 2"/>
     <w:basedOn w:val="Normal"/>
     <w:next w:val="Normal"/>
@@ -8938,7 +8709,7 @@
       <w:ind w:left="238"/>
     </w:pPr>
   </w:style>
-  <w:style w:type="paragraph" w:styleId="TOC4">
+  <w:style w:type="paragraph" w:styleId="TDC4">
     <w:name w:val="toc 4"/>
     <w:basedOn w:val="Normal"/>
     <w:next w:val="Normal"/>
@@ -8957,7 +8728,7 @@
       <w:lang w:val="es-MX" w:eastAsia="es-MX"/>
     </w:rPr>
   </w:style>
-  <w:style w:type="paragraph" w:styleId="TOC5">
+  <w:style w:type="paragraph" w:styleId="TDC5">
     <w:name w:val="toc 5"/>
     <w:basedOn w:val="Normal"/>
     <w:next w:val="Normal"/>
@@ -8976,7 +8747,7 @@
       <w:lang w:val="es-MX" w:eastAsia="es-MX"/>
     </w:rPr>
   </w:style>
-  <w:style w:type="paragraph" w:styleId="TOC6">
+  <w:style w:type="paragraph" w:styleId="TDC6">
     <w:name w:val="toc 6"/>
     <w:basedOn w:val="Normal"/>
     <w:next w:val="Normal"/>
@@ -8995,7 +8766,7 @@
       <w:lang w:val="es-MX" w:eastAsia="es-MX"/>
     </w:rPr>
   </w:style>
-  <w:style w:type="paragraph" w:styleId="TOC7">
+  <w:style w:type="paragraph" w:styleId="TDC7">
     <w:name w:val="toc 7"/>
     <w:basedOn w:val="Normal"/>
     <w:next w:val="Normal"/>
@@ -9014,7 +8785,7 @@
       <w:lang w:val="es-MX" w:eastAsia="es-MX"/>
     </w:rPr>
   </w:style>
-  <w:style w:type="paragraph" w:styleId="TOC8">
+  <w:style w:type="paragraph" w:styleId="TDC8">
     <w:name w:val="toc 8"/>
     <w:basedOn w:val="Normal"/>
     <w:next w:val="Normal"/>
@@ -9033,7 +8804,7 @@
       <w:lang w:val="es-MX" w:eastAsia="es-MX"/>
     </w:rPr>
   </w:style>
-  <w:style w:type="paragraph" w:styleId="TOC9">
+  <w:style w:type="paragraph" w:styleId="TDC9">
     <w:name w:val="toc 9"/>
     <w:basedOn w:val="Normal"/>
     <w:next w:val="Normal"/>
@@ -9052,9 +8823,9 @@
       <w:lang w:val="es-MX" w:eastAsia="es-MX"/>
     </w:rPr>
   </w:style>
-  <w:style w:type="character" w:styleId="Hyperlink">
+  <w:style w:type="character" w:styleId="Hipervnculo">
     <w:name w:val="Hyperlink"/>
-    <w:basedOn w:val="DefaultParagraphFont"/>
+    <w:basedOn w:val="Fuentedeprrafopredeter"/>
     <w:uiPriority w:val="99"/>
     <w:unhideWhenUsed/>
     <w:rsid w:val="00542D01"/>
@@ -9063,10 +8834,10 @@
       <w:u w:val="single"/>
     </w:rPr>
   </w:style>
-  <w:style w:type="character" w:customStyle="1" w:styleId="CommentSubjectChar">
-    <w:name w:val="Comment Subject Char"/>
-    <w:basedOn w:val="CommentTextChar"/>
-    <w:link w:val="CommentSubject"/>
+  <w:style w:type="character" w:customStyle="1" w:styleId="AsuntodelcomentarioCar">
+    <w:name w:val="Asunto del comentario Car"/>
+    <w:basedOn w:val="TextocomentarioCar"/>
+    <w:link w:val="Asuntodelcomentario"/>
     <w:uiPriority w:val="99"/>
     <w:semiHidden/>
     <w:rsid w:val="00542D01"/>
@@ -9079,11 +8850,11 @@
       <w:lang w:eastAsia="es-ES"/>
     </w:rPr>
   </w:style>
-  <w:style w:type="paragraph" w:styleId="CommentSubject">
+  <w:style w:type="paragraph" w:styleId="Asuntodelcomentario">
     <w:name w:val="annotation subject"/>
-    <w:basedOn w:val="CommentText"/>
-    <w:next w:val="CommentText"/>
-    <w:link w:val="CommentSubjectChar"/>
+    <w:basedOn w:val="Textocomentario"/>
+    <w:next w:val="Textocomentario"/>
+    <w:link w:val="AsuntodelcomentarioCar"/>
     <w:uiPriority w:val="99"/>
     <w:semiHidden/>
     <w:unhideWhenUsed/>
@@ -9120,9 +8891,9 @@
       <w:rFonts w:ascii="Calibri" w:eastAsia="Calibri" w:hAnsi="Calibri" w:cs="Times New Roman"/>
     </w:rPr>
   </w:style>
-  <w:style w:type="character" w:styleId="CommentReference">
+  <w:style w:type="character" w:styleId="Refdecomentario">
     <w:name w:val="annotation reference"/>
-    <w:basedOn w:val="DefaultParagraphFont"/>
+    <w:basedOn w:val="Fuentedeprrafopredeter"/>
     <w:uiPriority w:val="99"/>
     <w:semiHidden/>
     <w:unhideWhenUsed/>
@@ -9132,11 +8903,11 @@
       <w:szCs w:val="16"/>
     </w:rPr>
   </w:style>
-  <w:style w:type="paragraph" w:styleId="FootnoteText">
+  <w:style w:type="paragraph" w:styleId="Textonotapie">
     <w:name w:val="footnote text"/>
     <w:aliases w:val="Car,F,FN,FT,Footnote Text Char Char,Footnote Text Char Char Char1 Char1,Footnote Text Char Char Char1 Char1 Char Char,Footnote Text Char1,Footnote Text Char1 Char1 Char1 Char Char,Footnote Text Char2 Char Char,Texto nota pie Car,fn,ft,mod"/>
     <w:basedOn w:val="Normal"/>
-    <w:link w:val="FootnoteTextChar"/>
+    <w:link w:val="TextonotapieCar1"/>
     <w:uiPriority w:val="99"/>
     <w:unhideWhenUsed/>
     <w:qFormat/>
@@ -9145,11 +8916,11 @@
       <w:szCs w:val="20"/>
     </w:rPr>
   </w:style>
-  <w:style w:type="character" w:customStyle="1" w:styleId="FootnoteTextChar">
-    <w:name w:val="Footnote Text Char"/>
-    <w:aliases w:val="Car Char,F Char,FN Char,FT Char,Footnote Text Char Char Char,Footnote Text Char Char Char1 Char1 Char,Footnote Text Char Char Char1 Char1 Char Char Char,Footnote Text Char1 Char,Footnote Text Char1 Char1 Char1 Char Char Char,fn Char"/>
-    <w:basedOn w:val="DefaultParagraphFont"/>
-    <w:link w:val="FootnoteText"/>
+  <w:style w:type="character" w:customStyle="1" w:styleId="TextonotapieCar1">
+    <w:name w:val="Texto nota pie Car1"/>
+    <w:aliases w:val="Car Car,F Car,FN Car,FT Car,Footnote Text Char Char Car,Footnote Text Char Char Char1 Char1 Car,Footnote Text Char Char Char1 Char1 Char Char Car,Footnote Text Char1 Car,Footnote Text Char1 Char1 Char1 Char Char Car,fn Car,ft Car"/>
+    <w:basedOn w:val="Fuentedeprrafopredeter"/>
+    <w:link w:val="Textonotapie"/>
     <w:uiPriority w:val="99"/>
     <w:rsid w:val="00542D01"/>
     <w:rPr>
@@ -9159,7 +8930,7 @@
       <w:lang w:eastAsia="es-CO"/>
     </w:rPr>
   </w:style>
-  <w:style w:type="character" w:styleId="FootnoteReference">
+  <w:style w:type="character" w:styleId="Refdenotaalpie">
     <w:name w:val="footnote reference"/>
     <w:aliases w:val="Style 24,fr,Ref. de nota al pi,* Nota de rodapé,Appel note de bas de p,FC,Nota de rodapé,Pie de P_,Pie de P_g,Pie de P_gin,Pie de Pàgina,Pie de Página,Ref,Ref. de nota al pie 2,Texto de nota al p,Texto de nota al pi,de nota al pi,o,*"/>
     <w:uiPriority w:val="99"/>
@@ -9174,7 +8945,7 @@
   </w:style>
   <w:style w:type="character" w:customStyle="1" w:styleId="Mencinsinresolver1">
     <w:name w:val="Mención sin resolver1"/>
-    <w:basedOn w:val="DefaultParagraphFont"/>
+    <w:basedOn w:val="Fuentedeprrafopredeter"/>
     <w:uiPriority w:val="99"/>
     <w:semiHidden/>
     <w:unhideWhenUsed/>
@@ -9250,7 +9021,7 @@
   </w:style>
   <w:style w:type="character" w:customStyle="1" w:styleId="AmArticle3Char">
     <w:name w:val="Am_Article 3 Char"/>
-    <w:basedOn w:val="DefaultParagraphFont"/>
+    <w:basedOn w:val="Fuentedeprrafopredeter"/>
     <w:link w:val="AmArticle3"/>
     <w:rsid w:val="00542D01"/>
     <w:rPr>
@@ -9376,7 +9147,7 @@
   </w:style>
   <w:style w:type="character" w:customStyle="1" w:styleId="AmArticle4Char">
     <w:name w:val="Am_Article 4 Char"/>
-    <w:basedOn w:val="DefaultParagraphFont"/>
+    <w:basedOn w:val="Fuentedeprrafopredeter"/>
     <w:link w:val="AmArticle4"/>
     <w:rsid w:val="00542D01"/>
     <w:rPr>
@@ -9387,7 +9158,7 @@
   </w:style>
   <w:style w:type="character" w:customStyle="1" w:styleId="AmArticle5Char">
     <w:name w:val="Am_Article 5 Char"/>
-    <w:basedOn w:val="DefaultParagraphFont"/>
+    <w:basedOn w:val="Fuentedeprrafopredeter"/>
     <w:link w:val="AmArticle5"/>
     <w:rsid w:val="00542D01"/>
     <w:rPr>
@@ -9397,10 +9168,10 @@
       <w:lang w:val="es-ES_tradnl" w:eastAsia="es-ES"/>
     </w:rPr>
   </w:style>
-  <w:style w:type="character" w:customStyle="1" w:styleId="ListParagraphChar">
-    <w:name w:val="List Paragraph Char"/>
-    <w:aliases w:val="Título1 Char,Colorful List - Accent 11 Char,Bolita Char,Párrafo antic Char,BOLADEF Char,Párrafo de lista2 Char,Párrafo de lista3 Char,Párrafo de lista21 Char,BOLA Char,1. Anexo Char,Colorful List Accent 1 Char,EY EPM - Lista Char"/>
-    <w:link w:val="ListParagraph"/>
+  <w:style w:type="character" w:customStyle="1" w:styleId="PrrafodelistaCar">
+    <w:name w:val="Párrafo de lista Car"/>
+    <w:aliases w:val="Título1 Car,Colorful List - Accent 11 Car,Bolita Car,Párrafo antic Car,BOLADEF Car,Párrafo de lista2 Car,Párrafo de lista3 Car,Párrafo de lista21 Car,BOLA Car,1. Anexo Car,Colorful List Accent 1 Car,EY EPM - Lista Car,Estilo 3 Car"/>
+    <w:link w:val="Prrafodelista"/>
     <w:uiPriority w:val="1"/>
     <w:qFormat/>
     <w:locked/>
@@ -9414,8 +9185,8 @@
   </w:style>
   <w:style w:type="table" w:customStyle="1" w:styleId="Tablaconcuadrcula1">
     <w:name w:val="Tabla con cuadrícula1"/>
-    <w:basedOn w:val="TableNormal"/>
-    <w:next w:val="TableGrid"/>
+    <w:basedOn w:val="Tablanormal"/>
+    <w:next w:val="Tablaconcuadrcula"/>
     <w:uiPriority w:val="5"/>
     <w:rsid w:val="00542D01"/>
     <w:pPr>
@@ -9439,10 +9210,10 @@
       </w:tblBorders>
     </w:tblPr>
   </w:style>
-  <w:style w:type="paragraph" w:styleId="HTMLPreformatted">
+  <w:style w:type="paragraph" w:styleId="HTMLconformatoprevio">
     <w:name w:val="HTML Preformatted"/>
     <w:basedOn w:val="Normal"/>
-    <w:link w:val="HTMLPreformattedChar"/>
+    <w:link w:val="HTMLconformatoprevioCar"/>
     <w:uiPriority w:val="99"/>
     <w:semiHidden/>
     <w:unhideWhenUsed/>
@@ -9473,10 +9244,10 @@
       <w:szCs w:val="20"/>
     </w:rPr>
   </w:style>
-  <w:style w:type="character" w:customStyle="1" w:styleId="HTMLPreformattedChar">
-    <w:name w:val="HTML Preformatted Char"/>
-    <w:basedOn w:val="DefaultParagraphFont"/>
-    <w:link w:val="HTMLPreformatted"/>
+  <w:style w:type="character" w:customStyle="1" w:styleId="HTMLconformatoprevioCar">
+    <w:name w:val="HTML con formato previo Car"/>
+    <w:basedOn w:val="Fuentedeprrafopredeter"/>
+    <w:link w:val="HTMLconformatoprevio"/>
     <w:uiPriority w:val="99"/>
     <w:semiHidden/>
     <w:rsid w:val="00542D01"/>
@@ -9489,7 +9260,7 @@
   </w:style>
   <w:style w:type="character" w:customStyle="1" w:styleId="y2iqfc">
     <w:name w:val="y2iqfc"/>
-    <w:basedOn w:val="DefaultParagraphFont"/>
+    <w:basedOn w:val="Fuentedeprrafopredeter"/>
     <w:rsid w:val="00542D01"/>
   </w:style>
   <w:style w:type="paragraph" w:customStyle="1" w:styleId="Default">
@@ -9510,12 +9281,12 @@
   </w:style>
   <w:style w:type="character" w:customStyle="1" w:styleId="c-timestamplabel">
     <w:name w:val="c-timestamp__label"/>
-    <w:basedOn w:val="DefaultParagraphFont"/>
+    <w:basedOn w:val="Fuentedeprrafopredeter"/>
     <w:rsid w:val="00C02E59"/>
   </w:style>
   <w:style w:type="character" w:customStyle="1" w:styleId="c-messageactionslabelstext">
     <w:name w:val="c-message_actions__labels_text"/>
-    <w:basedOn w:val="DefaultParagraphFont"/>
+    <w:basedOn w:val="Fuentedeprrafopredeter"/>
     <w:rsid w:val="00C02E59"/>
   </w:style>
   <w:style w:type="paragraph" w:styleId="NormalWeb">
@@ -9533,7 +9304,7 @@
       <w:lang w:val="en-US" w:eastAsia="en-US"/>
     </w:rPr>
   </w:style>
-  <w:style w:type="paragraph" w:styleId="Revision">
+  <w:style w:type="paragraph" w:styleId="Revisin">
     <w:name w:val="Revision"/>
     <w:hidden/>
     <w:uiPriority w:val="99"/>
@@ -9592,9 +9363,9 @@
       <w:lang w:val="es-ES" w:eastAsia="en-US"/>
     </w:rPr>
   </w:style>
-  <w:style w:type="character" w:styleId="UnresolvedMention">
+  <w:style w:type="character" w:styleId="Mencinsinresolver">
     <w:name w:val="Unresolved Mention"/>
-    <w:basedOn w:val="DefaultParagraphFont"/>
+    <w:basedOn w:val="Fuentedeprrafopredeter"/>
     <w:uiPriority w:val="99"/>
     <w:semiHidden/>
     <w:unhideWhenUsed/>
@@ -9737,7 +9508,7 @@
   </w:style>
   <w:style w:type="character" w:customStyle="1" w:styleId="RomanosCar">
     <w:name w:val="Romanos Car"/>
-    <w:basedOn w:val="DefaultParagraphFont"/>
+    <w:basedOn w:val="Fuentedeprrafopredeter"/>
     <w:link w:val="Romanos"/>
     <w:rsid w:val="002E6D54"/>
     <w:rPr>
@@ -9746,7 +9517,7 @@
   </w:style>
   <w:style w:type="paragraph" w:customStyle="1" w:styleId="Estilo2">
     <w:name w:val="Estilo2"/>
-    <w:basedOn w:val="Heading3"/>
+    <w:basedOn w:val="Ttulo3"/>
     <w:link w:val="Estilo2Car"/>
     <w:qFormat/>
     <w:rsid w:val="00C468A3"/>
@@ -9771,7 +9542,7 @@
   </w:style>
   <w:style w:type="character" w:customStyle="1" w:styleId="Estilo2Car">
     <w:name w:val="Estilo2 Car"/>
-    <w:basedOn w:val="DefaultParagraphFont"/>
+    <w:basedOn w:val="Fuentedeprrafopredeter"/>
     <w:link w:val="Estilo2"/>
     <w:rsid w:val="00C468A3"/>
     <w:rPr>
@@ -9780,9 +9551,9 @@
       <w:szCs w:val="26"/>
     </w:rPr>
   </w:style>
-  <w:style w:type="character" w:styleId="FollowedHyperlink">
+  <w:style w:type="character" w:styleId="Hipervnculovisitado">
     <w:name w:val="FollowedHyperlink"/>
-    <w:basedOn w:val="DefaultParagraphFont"/>
+    <w:basedOn w:val="Fuentedeprrafopredeter"/>
     <w:uiPriority w:val="99"/>
     <w:semiHidden/>
     <w:unhideWhenUsed/>
@@ -9794,7 +9565,7 @@
   </w:style>
   <w:style w:type="table" w:customStyle="1" w:styleId="TableGrid1">
     <w:name w:val="Table Grid1"/>
-    <w:basedOn w:val="TableNormal"/>
+    <w:basedOn w:val="Tablanormal"/>
     <w:uiPriority w:val="39"/>
     <w:rsid w:val="002D19D9"/>
     <w:pPr>
@@ -9837,11 +9608,11 @@
       <w:tblInd w:w="0" w:type="nil"/>
     </w:tblPr>
   </w:style>
-  <w:style w:type="paragraph" w:styleId="Subtitle">
+  <w:style w:type="paragraph" w:styleId="Subttulo">
     <w:name w:val="Subtitle"/>
     <w:basedOn w:val="Normal"/>
     <w:next w:val="Normal"/>
-    <w:link w:val="SubtitleChar"/>
+    <w:link w:val="SubttuloCar"/>
     <w:uiPriority w:val="11"/>
     <w:qFormat/>
     <w:rsid w:val="00D525BE"/>
@@ -9859,10 +9630,10 @@
       <w:szCs w:val="22"/>
     </w:rPr>
   </w:style>
-  <w:style w:type="character" w:customStyle="1" w:styleId="SubtitleChar">
-    <w:name w:val="Subtitle Char"/>
-    <w:basedOn w:val="DefaultParagraphFont"/>
-    <w:link w:val="Subtitle"/>
+  <w:style w:type="character" w:customStyle="1" w:styleId="SubttuloCar">
+    <w:name w:val="Subtítulo Car"/>
+    <w:basedOn w:val="Fuentedeprrafopredeter"/>
+    <w:link w:val="Subttulo"/>
     <w:uiPriority w:val="11"/>
     <w:rsid w:val="00D525BE"/>
     <w:rPr>
@@ -9874,7 +9645,7 @@
   </w:style>
   <w:style w:type="character" w:customStyle="1" w:styleId="AmArticle2Car">
     <w:name w:val="Am_Article 2 Car"/>
-    <w:basedOn w:val="DefaultParagraphFont"/>
+    <w:basedOn w:val="Fuentedeprrafopredeter"/>
     <w:link w:val="AmArticle2"/>
     <w:rsid w:val="000939DA"/>
     <w:rPr>
@@ -9887,7 +9658,7 @@
   </w:style>
   <w:style w:type="character" w:customStyle="1" w:styleId="AmArticle3Car">
     <w:name w:val="Am_Article 3 Car"/>
-    <w:basedOn w:val="DefaultParagraphFont"/>
+    <w:basedOn w:val="Fuentedeprrafopredeter"/>
     <w:rsid w:val="000939DA"/>
     <w:rPr>
       <w:rFonts w:ascii="Open Sans" w:eastAsia="Times New Roman" w:hAnsi="Open Sans" w:cs="Times New Roman"/>

</xml_diff>